<commit_message>
Update resume file (Bui_Cao_Nguyen_Resume_Yale.docx)
</commit_message>
<xml_diff>
--- a/public/Bui_Cao_Nguyen_Resume_Yale.docx
+++ b/public/Bui_Cao_Nguyen_Resume_Yale.docx
@@ -38,7 +38,23 @@
         <w:rPr>
           <w:sz w:val="19"/>
         </w:rPr>
-        <w:t>Ho Chi Minh City, Vietnam  |  0944015003  |  buicaonguyen115@email.com  |  linkedin.com/in/bui-cao-nguyen11</w:t>
+        <w:t>Ho Chi Minh City, Vietnam  |  0944015003  |  buicaonguyen115@</w:t>
+      </w:r>
+      <w:r>
+        <w:rPr>
+          <w:rFonts w:hint="default"/>
+          <w:sz w:val="19"/>
+          <w:lang w:val="en-US"/>
+        </w:rPr>
+        <w:t>g</w:t>
+      </w:r>
+      <w:bookmarkStart w:id="0" w:name="_GoBack"/>
+      <w:bookmarkEnd w:id="0"/>
+      <w:r>
+        <w:rPr>
+          <w:sz w:val="19"/>
+        </w:rPr>
+        <w:t>mail.com  |  linkedin.com/in/bui-cao-nguyen11</w:t>
       </w:r>
     </w:p>
     <w:p>
@@ -338,8 +354,6 @@
       <w:r>
         <w:tab/>
       </w:r>
-      <w:bookmarkStart w:id="0" w:name="_GoBack"/>
-      <w:bookmarkEnd w:id="0"/>
       <w:r>
         <w:rPr>
           <w:rFonts w:hint="default"/>
@@ -930,18 +944,18 @@
     <w:lsdException w:uiPriority="99" w:name="table of authorities"/>
     <w:lsdException w:uiPriority="99" w:semiHidden="0" w:name="macro"/>
     <w:lsdException w:uiPriority="99" w:name="toa heading"/>
-    <w:lsdException w:uiPriority="99" w:semiHidden="0" w:name="List"/>
-    <w:lsdException w:uiPriority="99" w:semiHidden="0" w:name="List Bullet"/>
+    <w:lsdException w:qFormat="1" w:uiPriority="99" w:semiHidden="0" w:name="List"/>
+    <w:lsdException w:qFormat="1" w:uiPriority="99" w:semiHidden="0" w:name="List Bullet"/>
     <w:lsdException w:uiPriority="99" w:semiHidden="0" w:name="List Number"/>
-    <w:lsdException w:uiPriority="99" w:semiHidden="0" w:name="List 2"/>
-    <w:lsdException w:uiPriority="99" w:semiHidden="0" w:name="List 3"/>
+    <w:lsdException w:qFormat="1" w:uiPriority="99" w:semiHidden="0" w:name="List 2"/>
+    <w:lsdException w:qFormat="1" w:uiPriority="99" w:semiHidden="0" w:name="List 3"/>
     <w:lsdException w:uiPriority="99" w:name="List 4"/>
     <w:lsdException w:uiPriority="99" w:name="List 5"/>
-    <w:lsdException w:uiPriority="99" w:semiHidden="0" w:name="List Bullet 2"/>
-    <w:lsdException w:uiPriority="99" w:semiHidden="0" w:name="List Bullet 3"/>
+    <w:lsdException w:qFormat="1" w:uiPriority="99" w:semiHidden="0" w:name="List Bullet 2"/>
+    <w:lsdException w:qFormat="1" w:uiPriority="99" w:semiHidden="0" w:name="List Bullet 3"/>
     <w:lsdException w:uiPriority="99" w:name="List Bullet 4"/>
     <w:lsdException w:uiPriority="99" w:name="List Bullet 5"/>
-    <w:lsdException w:uiPriority="99" w:semiHidden="0" w:name="List Number 2"/>
+    <w:lsdException w:qFormat="1" w:uiPriority="99" w:semiHidden="0" w:name="List Number 2"/>
     <w:lsdException w:uiPriority="99" w:semiHidden="0" w:name="List Number 3"/>
     <w:lsdException w:uiPriority="99" w:name="List Number 4"/>
     <w:lsdException w:uiPriority="99" w:name="List Number 5"/>
@@ -949,11 +963,11 @@
     <w:lsdException w:uiPriority="99" w:name="Closing"/>
     <w:lsdException w:uiPriority="99" w:name="Signature"/>
     <w:lsdException w:qFormat="1" w:uiPriority="1" w:name="Default Paragraph Font"/>
-    <w:lsdException w:uiPriority="99" w:semiHidden="0" w:name="Body Text"/>
+    <w:lsdException w:qFormat="1" w:uiPriority="99" w:semiHidden="0" w:name="Body Text"/>
     <w:lsdException w:uiPriority="99" w:name="Body Text Indent"/>
-    <w:lsdException w:uiPriority="99" w:semiHidden="0" w:name="List Continue"/>
-    <w:lsdException w:uiPriority="99" w:semiHidden="0" w:name="List Continue 2"/>
-    <w:lsdException w:uiPriority="99" w:semiHidden="0" w:name="List Continue 3"/>
+    <w:lsdException w:qFormat="1" w:uiPriority="99" w:semiHidden="0" w:name="List Continue"/>
+    <w:lsdException w:qFormat="1" w:uiPriority="99" w:semiHidden="0" w:name="List Continue 2"/>
+    <w:lsdException w:qFormat="1" w:uiPriority="99" w:semiHidden="0" w:name="List Continue 3"/>
     <w:lsdException w:uiPriority="99" w:name="List Continue 4"/>
     <w:lsdException w:uiPriority="99" w:name="List Continue 5"/>
     <w:lsdException w:uiPriority="99" w:name="Message Header"/>
@@ -964,7 +978,7 @@
     <w:lsdException w:uiPriority="99" w:name="Body Text First Indent 2"/>
     <w:lsdException w:uiPriority="99" w:name="Note Heading"/>
     <w:lsdException w:uiPriority="99" w:semiHidden="0" w:name="Body Text 2"/>
-    <w:lsdException w:uiPriority="99" w:semiHidden="0" w:name="Body Text 3"/>
+    <w:lsdException w:qFormat="1" w:uiPriority="99" w:semiHidden="0" w:name="Body Text 3"/>
     <w:lsdException w:uiPriority="99" w:name="Body Text Indent 2"/>
     <w:lsdException w:uiPriority="99" w:name="Body Text Indent 3"/>
     <w:lsdException w:uiPriority="99" w:name="Block Text"/>
@@ -1036,102 +1050,102 @@
     <w:lsdException w:qFormat="1" w:unhideWhenUsed="0" w:uiPriority="1" w:semiHidden="0" w:name="No Spacing"/>
     <w:lsdException w:unhideWhenUsed="0" w:uiPriority="60" w:semiHidden="0" w:name="Light Shading"/>
     <w:lsdException w:unhideWhenUsed="0" w:uiPriority="61" w:semiHidden="0" w:name="Light List"/>
-    <w:lsdException w:unhideWhenUsed="0" w:uiPriority="62" w:semiHidden="0" w:name="Light Grid"/>
+    <w:lsdException w:qFormat="1" w:unhideWhenUsed="0" w:uiPriority="62" w:semiHidden="0" w:name="Light Grid"/>
     <w:lsdException w:unhideWhenUsed="0" w:uiPriority="63" w:semiHidden="0" w:name="Medium Shading 1"/>
     <w:lsdException w:unhideWhenUsed="0" w:uiPriority="64" w:semiHidden="0" w:name="Medium Shading 2"/>
     <w:lsdException w:unhideWhenUsed="0" w:uiPriority="65" w:semiHidden="0" w:name="Medium List 1"/>
     <w:lsdException w:unhideWhenUsed="0" w:uiPriority="66" w:semiHidden="0" w:name="Medium List 2"/>
-    <w:lsdException w:unhideWhenUsed="0" w:uiPriority="67" w:semiHidden="0" w:name="Medium Grid 1"/>
-    <w:lsdException w:unhideWhenUsed="0" w:uiPriority="68" w:semiHidden="0" w:name="Medium Grid 2"/>
+    <w:lsdException w:qFormat="1" w:unhideWhenUsed="0" w:uiPriority="67" w:semiHidden="0" w:name="Medium Grid 1"/>
+    <w:lsdException w:qFormat="1" w:unhideWhenUsed="0" w:uiPriority="68" w:semiHidden="0" w:name="Medium Grid 2"/>
     <w:lsdException w:unhideWhenUsed="0" w:uiPriority="69" w:semiHidden="0" w:name="Medium Grid 3"/>
-    <w:lsdException w:unhideWhenUsed="0" w:uiPriority="70" w:semiHidden="0" w:name="Dark List"/>
-    <w:lsdException w:unhideWhenUsed="0" w:uiPriority="71" w:semiHidden="0" w:name="Colorful Shading"/>
-    <w:lsdException w:unhideWhenUsed="0" w:uiPriority="72" w:semiHidden="0" w:name="Colorful List"/>
+    <w:lsdException w:qFormat="1" w:unhideWhenUsed="0" w:uiPriority="70" w:semiHidden="0" w:name="Dark List"/>
+    <w:lsdException w:qFormat="1" w:unhideWhenUsed="0" w:uiPriority="71" w:semiHidden="0" w:name="Colorful Shading"/>
+    <w:lsdException w:qFormat="1" w:unhideWhenUsed="0" w:uiPriority="72" w:semiHidden="0" w:name="Colorful List"/>
     <w:lsdException w:unhideWhenUsed="0" w:uiPriority="73" w:semiHidden="0" w:name="Colorful Grid"/>
     <w:lsdException w:unhideWhenUsed="0" w:uiPriority="60" w:semiHidden="0" w:name="Light Shading Accent 1"/>
     <w:lsdException w:unhideWhenUsed="0" w:uiPriority="61" w:semiHidden="0" w:name="Light List Accent 1"/>
-    <w:lsdException w:unhideWhenUsed="0" w:uiPriority="62" w:semiHidden="0" w:name="Light Grid Accent 1"/>
-    <w:lsdException w:unhideWhenUsed="0" w:uiPriority="63" w:semiHidden="0" w:name="Medium Shading 1 Accent 1"/>
-    <w:lsdException w:unhideWhenUsed="0" w:uiPriority="64" w:semiHidden="0" w:name="Medium Shading 2 Accent 1"/>
-    <w:lsdException w:unhideWhenUsed="0" w:uiPriority="65" w:semiHidden="0" w:name="Medium List 1 Accent 1"/>
+    <w:lsdException w:qFormat="1" w:unhideWhenUsed="0" w:uiPriority="62" w:semiHidden="0" w:name="Light Grid Accent 1"/>
+    <w:lsdException w:qFormat="1" w:unhideWhenUsed="0" w:uiPriority="63" w:semiHidden="0" w:name="Medium Shading 1 Accent 1"/>
+    <w:lsdException w:qFormat="1" w:unhideWhenUsed="0" w:uiPriority="64" w:semiHidden="0" w:name="Medium Shading 2 Accent 1"/>
+    <w:lsdException w:qFormat="1" w:unhideWhenUsed="0" w:uiPriority="65" w:semiHidden="0" w:name="Medium List 1 Accent 1"/>
     <w:lsdException w:qFormat="1" w:unhideWhenUsed="0" w:uiPriority="34" w:semiHidden="0" w:name="List Paragraph"/>
     <w:lsdException w:qFormat="1" w:unhideWhenUsed="0" w:uiPriority="29" w:semiHidden="0" w:name="Quote"/>
     <w:lsdException w:qFormat="1" w:unhideWhenUsed="0" w:uiPriority="30" w:semiHidden="0" w:name="Intense Quote"/>
-    <w:lsdException w:unhideWhenUsed="0" w:uiPriority="66" w:semiHidden="0" w:name="Medium List 2 Accent 1"/>
+    <w:lsdException w:qFormat="1" w:unhideWhenUsed="0" w:uiPriority="66" w:semiHidden="0" w:name="Medium List 2 Accent 1"/>
     <w:lsdException w:unhideWhenUsed="0" w:uiPriority="67" w:semiHidden="0" w:name="Medium Grid 1 Accent 1"/>
-    <w:lsdException w:unhideWhenUsed="0" w:uiPriority="68" w:semiHidden="0" w:name="Medium Grid 2 Accent 1"/>
-    <w:lsdException w:unhideWhenUsed="0" w:uiPriority="69" w:semiHidden="0" w:name="Medium Grid 3 Accent 1"/>
+    <w:lsdException w:qFormat="1" w:unhideWhenUsed="0" w:uiPriority="68" w:semiHidden="0" w:name="Medium Grid 2 Accent 1"/>
+    <w:lsdException w:qFormat="1" w:unhideWhenUsed="0" w:uiPriority="69" w:semiHidden="0" w:name="Medium Grid 3 Accent 1"/>
     <w:lsdException w:unhideWhenUsed="0" w:uiPriority="70" w:semiHidden="0" w:name="Dark List Accent 1"/>
     <w:lsdException w:unhideWhenUsed="0" w:uiPriority="71" w:semiHidden="0" w:name="Colorful Shading Accent 1"/>
     <w:lsdException w:unhideWhenUsed="0" w:uiPriority="72" w:semiHidden="0" w:name="Colorful List Accent 1"/>
-    <w:lsdException w:unhideWhenUsed="0" w:uiPriority="73" w:semiHidden="0" w:name="Colorful Grid Accent 1"/>
+    <w:lsdException w:qFormat="1" w:unhideWhenUsed="0" w:uiPriority="73" w:semiHidden="0" w:name="Colorful Grid Accent 1"/>
     <w:lsdException w:unhideWhenUsed="0" w:uiPriority="60" w:semiHidden="0" w:name="Light Shading Accent 2"/>
     <w:lsdException w:unhideWhenUsed="0" w:uiPriority="61" w:semiHidden="0" w:name="Light List Accent 2"/>
-    <w:lsdException w:unhideWhenUsed="0" w:uiPriority="62" w:semiHidden="0" w:name="Light Grid Accent 2"/>
-    <w:lsdException w:unhideWhenUsed="0" w:uiPriority="63" w:semiHidden="0" w:name="Medium Shading 1 Accent 2"/>
+    <w:lsdException w:qFormat="1" w:unhideWhenUsed="0" w:uiPriority="62" w:semiHidden="0" w:name="Light Grid Accent 2"/>
+    <w:lsdException w:qFormat="1" w:unhideWhenUsed="0" w:uiPriority="63" w:semiHidden="0" w:name="Medium Shading 1 Accent 2"/>
     <w:lsdException w:unhideWhenUsed="0" w:uiPriority="64" w:semiHidden="0" w:name="Medium Shading 2 Accent 2"/>
     <w:lsdException w:unhideWhenUsed="0" w:uiPriority="65" w:semiHidden="0" w:name="Medium List 1 Accent 2"/>
     <w:lsdException w:unhideWhenUsed="0" w:uiPriority="66" w:semiHidden="0" w:name="Medium List 2 Accent 2"/>
-    <w:lsdException w:unhideWhenUsed="0" w:uiPriority="67" w:semiHidden="0" w:name="Medium Grid 1 Accent 2"/>
+    <w:lsdException w:qFormat="1" w:unhideWhenUsed="0" w:uiPriority="67" w:semiHidden="0" w:name="Medium Grid 1 Accent 2"/>
     <w:lsdException w:unhideWhenUsed="0" w:uiPriority="68" w:semiHidden="0" w:name="Medium Grid 2 Accent 2"/>
     <w:lsdException w:unhideWhenUsed="0" w:uiPriority="69" w:semiHidden="0" w:name="Medium Grid 3 Accent 2"/>
     <w:lsdException w:unhideWhenUsed="0" w:uiPriority="70" w:semiHidden="0" w:name="Dark List Accent 2"/>
     <w:lsdException w:unhideWhenUsed="0" w:uiPriority="71" w:semiHidden="0" w:name="Colorful Shading Accent 2"/>
     <w:lsdException w:unhideWhenUsed="0" w:uiPriority="72" w:semiHidden="0" w:name="Colorful List Accent 2"/>
-    <w:lsdException w:unhideWhenUsed="0" w:uiPriority="73" w:semiHidden="0" w:name="Colorful Grid Accent 2"/>
+    <w:lsdException w:qFormat="1" w:unhideWhenUsed="0" w:uiPriority="73" w:semiHidden="0" w:name="Colorful Grid Accent 2"/>
     <w:lsdException w:unhideWhenUsed="0" w:uiPriority="60" w:semiHidden="0" w:name="Light Shading Accent 3"/>
     <w:lsdException w:unhideWhenUsed="0" w:uiPriority="61" w:semiHidden="0" w:name="Light List Accent 3"/>
-    <w:lsdException w:unhideWhenUsed="0" w:uiPriority="62" w:semiHidden="0" w:name="Light Grid Accent 3"/>
-    <w:lsdException w:unhideWhenUsed="0" w:uiPriority="63" w:semiHidden="0" w:name="Medium Shading 1 Accent 3"/>
-    <w:lsdException w:unhideWhenUsed="0" w:uiPriority="64" w:semiHidden="0" w:name="Medium Shading 2 Accent 3"/>
-    <w:lsdException w:unhideWhenUsed="0" w:uiPriority="65" w:semiHidden="0" w:name="Medium List 1 Accent 3"/>
+    <w:lsdException w:qFormat="1" w:unhideWhenUsed="0" w:uiPriority="62" w:semiHidden="0" w:name="Light Grid Accent 3"/>
+    <w:lsdException w:qFormat="1" w:unhideWhenUsed="0" w:uiPriority="63" w:semiHidden="0" w:name="Medium Shading 1 Accent 3"/>
+    <w:lsdException w:qFormat="1" w:unhideWhenUsed="0" w:uiPriority="64" w:semiHidden="0" w:name="Medium Shading 2 Accent 3"/>
+    <w:lsdException w:qFormat="1" w:unhideWhenUsed="0" w:uiPriority="65" w:semiHidden="0" w:name="Medium List 1 Accent 3"/>
     <w:lsdException w:unhideWhenUsed="0" w:uiPriority="66" w:semiHidden="0" w:name="Medium List 2 Accent 3"/>
-    <w:lsdException w:unhideWhenUsed="0" w:uiPriority="67" w:semiHidden="0" w:name="Medium Grid 1 Accent 3"/>
+    <w:lsdException w:qFormat="1" w:unhideWhenUsed="0" w:uiPriority="67" w:semiHidden="0" w:name="Medium Grid 1 Accent 3"/>
     <w:lsdException w:unhideWhenUsed="0" w:uiPriority="68" w:semiHidden="0" w:name="Medium Grid 2 Accent 3"/>
-    <w:lsdException w:unhideWhenUsed="0" w:uiPriority="69" w:semiHidden="0" w:name="Medium Grid 3 Accent 3"/>
+    <w:lsdException w:qFormat="1" w:unhideWhenUsed="0" w:uiPriority="69" w:semiHidden="0" w:name="Medium Grid 3 Accent 3"/>
     <w:lsdException w:unhideWhenUsed="0" w:uiPriority="70" w:semiHidden="0" w:name="Dark List Accent 3"/>
-    <w:lsdException w:unhideWhenUsed="0" w:uiPriority="71" w:semiHidden="0" w:name="Colorful Shading Accent 3"/>
+    <w:lsdException w:qFormat="1" w:unhideWhenUsed="0" w:uiPriority="71" w:semiHidden="0" w:name="Colorful Shading Accent 3"/>
     <w:lsdException w:unhideWhenUsed="0" w:uiPriority="72" w:semiHidden="0" w:name="Colorful List Accent 3"/>
-    <w:lsdException w:unhideWhenUsed="0" w:uiPriority="73" w:semiHidden="0" w:name="Colorful Grid Accent 3"/>
+    <w:lsdException w:qFormat="1" w:unhideWhenUsed="0" w:uiPriority="73" w:semiHidden="0" w:name="Colorful Grid Accent 3"/>
     <w:lsdException w:unhideWhenUsed="0" w:uiPriority="60" w:semiHidden="0" w:name="Light Shading Accent 4"/>
     <w:lsdException w:unhideWhenUsed="0" w:uiPriority="61" w:semiHidden="0" w:name="Light List Accent 4"/>
-    <w:lsdException w:unhideWhenUsed="0" w:uiPriority="62" w:semiHidden="0" w:name="Light Grid Accent 4"/>
-    <w:lsdException w:unhideWhenUsed="0" w:uiPriority="63" w:semiHidden="0" w:name="Medium Shading 1 Accent 4"/>
-    <w:lsdException w:unhideWhenUsed="0" w:uiPriority="64" w:semiHidden="0" w:name="Medium Shading 2 Accent 4"/>
+    <w:lsdException w:qFormat="1" w:unhideWhenUsed="0" w:uiPriority="62" w:semiHidden="0" w:name="Light Grid Accent 4"/>
+    <w:lsdException w:qFormat="1" w:unhideWhenUsed="0" w:uiPriority="63" w:semiHidden="0" w:name="Medium Shading 1 Accent 4"/>
+    <w:lsdException w:qFormat="1" w:unhideWhenUsed="0" w:uiPriority="64" w:semiHidden="0" w:name="Medium Shading 2 Accent 4"/>
     <w:lsdException w:unhideWhenUsed="0" w:uiPriority="65" w:semiHidden="0" w:name="Medium List 1 Accent 4"/>
     <w:lsdException w:unhideWhenUsed="0" w:uiPriority="66" w:semiHidden="0" w:name="Medium List 2 Accent 4"/>
     <w:lsdException w:unhideWhenUsed="0" w:uiPriority="67" w:semiHidden="0" w:name="Medium Grid 1 Accent 4"/>
-    <w:lsdException w:unhideWhenUsed="0" w:uiPriority="68" w:semiHidden="0" w:name="Medium Grid 2 Accent 4"/>
+    <w:lsdException w:qFormat="1" w:unhideWhenUsed="0" w:uiPriority="68" w:semiHidden="0" w:name="Medium Grid 2 Accent 4"/>
     <w:lsdException w:unhideWhenUsed="0" w:uiPriority="69" w:semiHidden="0" w:name="Medium Grid 3 Accent 4"/>
     <w:lsdException w:unhideWhenUsed="0" w:uiPriority="70" w:semiHidden="0" w:name="Dark List Accent 4"/>
     <w:lsdException w:unhideWhenUsed="0" w:uiPriority="71" w:semiHidden="0" w:name="Colorful Shading Accent 4"/>
-    <w:lsdException w:unhideWhenUsed="0" w:uiPriority="72" w:semiHidden="0" w:name="Colorful List Accent 4"/>
-    <w:lsdException w:unhideWhenUsed="0" w:uiPriority="73" w:semiHidden="0" w:name="Colorful Grid Accent 4"/>
+    <w:lsdException w:qFormat="1" w:unhideWhenUsed="0" w:uiPriority="72" w:semiHidden="0" w:name="Colorful List Accent 4"/>
+    <w:lsdException w:qFormat="1" w:unhideWhenUsed="0" w:uiPriority="73" w:semiHidden="0" w:name="Colorful Grid Accent 4"/>
     <w:lsdException w:unhideWhenUsed="0" w:uiPriority="60" w:semiHidden="0" w:name="Light Shading Accent 5"/>
     <w:lsdException w:unhideWhenUsed="0" w:uiPriority="61" w:semiHidden="0" w:name="Light List Accent 5"/>
-    <w:lsdException w:unhideWhenUsed="0" w:uiPriority="62" w:semiHidden="0" w:name="Light Grid Accent 5"/>
-    <w:lsdException w:unhideWhenUsed="0" w:uiPriority="63" w:semiHidden="0" w:name="Medium Shading 1 Accent 5"/>
-    <w:lsdException w:unhideWhenUsed="0" w:uiPriority="64" w:semiHidden="0" w:name="Medium Shading 2 Accent 5"/>
+    <w:lsdException w:qFormat="1" w:unhideWhenUsed="0" w:uiPriority="62" w:semiHidden="0" w:name="Light Grid Accent 5"/>
+    <w:lsdException w:qFormat="1" w:unhideWhenUsed="0" w:uiPriority="63" w:semiHidden="0" w:name="Medium Shading 1 Accent 5"/>
+    <w:lsdException w:qFormat="1" w:unhideWhenUsed="0" w:uiPriority="64" w:semiHidden="0" w:name="Medium Shading 2 Accent 5"/>
     <w:lsdException w:unhideWhenUsed="0" w:uiPriority="65" w:semiHidden="0" w:name="Medium List 1 Accent 5"/>
-    <w:lsdException w:unhideWhenUsed="0" w:uiPriority="66" w:semiHidden="0" w:name="Medium List 2 Accent 5"/>
+    <w:lsdException w:qFormat="1" w:unhideWhenUsed="0" w:uiPriority="66" w:semiHidden="0" w:name="Medium List 2 Accent 5"/>
     <w:lsdException w:unhideWhenUsed="0" w:uiPriority="67" w:semiHidden="0" w:name="Medium Grid 1 Accent 5"/>
     <w:lsdException w:unhideWhenUsed="0" w:uiPriority="68" w:semiHidden="0" w:name="Medium Grid 2 Accent 5"/>
-    <w:lsdException w:unhideWhenUsed="0" w:uiPriority="69" w:semiHidden="0" w:name="Medium Grid 3 Accent 5"/>
+    <w:lsdException w:qFormat="1" w:unhideWhenUsed="0" w:uiPriority="69" w:semiHidden="0" w:name="Medium Grid 3 Accent 5"/>
     <w:lsdException w:unhideWhenUsed="0" w:uiPriority="70" w:semiHidden="0" w:name="Dark List Accent 5"/>
     <w:lsdException w:unhideWhenUsed="0" w:uiPriority="71" w:semiHidden="0" w:name="Colorful Shading Accent 5"/>
-    <w:lsdException w:unhideWhenUsed="0" w:uiPriority="72" w:semiHidden="0" w:name="Colorful List Accent 5"/>
+    <w:lsdException w:qFormat="1" w:unhideWhenUsed="0" w:uiPriority="72" w:semiHidden="0" w:name="Colorful List Accent 5"/>
     <w:lsdException w:unhideWhenUsed="0" w:uiPriority="73" w:semiHidden="0" w:name="Colorful Grid Accent 5"/>
     <w:lsdException w:unhideWhenUsed="0" w:uiPriority="60" w:semiHidden="0" w:name="Light Shading Accent 6"/>
     <w:lsdException w:unhideWhenUsed="0" w:uiPriority="61" w:semiHidden="0" w:name="Light List Accent 6"/>
-    <w:lsdException w:unhideWhenUsed="0" w:uiPriority="62" w:semiHidden="0" w:name="Light Grid Accent 6"/>
-    <w:lsdException w:unhideWhenUsed="0" w:uiPriority="63" w:semiHidden="0" w:name="Medium Shading 1 Accent 6"/>
+    <w:lsdException w:qFormat="1" w:unhideWhenUsed="0" w:uiPriority="62" w:semiHidden="0" w:name="Light Grid Accent 6"/>
+    <w:lsdException w:qFormat="1" w:unhideWhenUsed="0" w:uiPriority="63" w:semiHidden="0" w:name="Medium Shading 1 Accent 6"/>
     <w:lsdException w:unhideWhenUsed="0" w:uiPriority="64" w:semiHidden="0" w:name="Medium Shading 2 Accent 6"/>
     <w:lsdException w:unhideWhenUsed="0" w:uiPriority="65" w:semiHidden="0" w:name="Medium List 1 Accent 6"/>
-    <w:lsdException w:unhideWhenUsed="0" w:uiPriority="66" w:semiHidden="0" w:name="Medium List 2 Accent 6"/>
-    <w:lsdException w:unhideWhenUsed="0" w:uiPriority="67" w:semiHidden="0" w:name="Medium Grid 1 Accent 6"/>
-    <w:lsdException w:unhideWhenUsed="0" w:uiPriority="68" w:semiHidden="0" w:name="Medium Grid 2 Accent 6"/>
-    <w:lsdException w:unhideWhenUsed="0" w:uiPriority="69" w:semiHidden="0" w:name="Medium Grid 3 Accent 6"/>
-    <w:lsdException w:unhideWhenUsed="0" w:uiPriority="70" w:semiHidden="0" w:name="Dark List Accent 6"/>
+    <w:lsdException w:qFormat="1" w:unhideWhenUsed="0" w:uiPriority="66" w:semiHidden="0" w:name="Medium List 2 Accent 6"/>
+    <w:lsdException w:qFormat="1" w:unhideWhenUsed="0" w:uiPriority="67" w:semiHidden="0" w:name="Medium Grid 1 Accent 6"/>
+    <w:lsdException w:qFormat="1" w:unhideWhenUsed="0" w:uiPriority="68" w:semiHidden="0" w:name="Medium Grid 2 Accent 6"/>
+    <w:lsdException w:qFormat="1" w:unhideWhenUsed="0" w:uiPriority="69" w:semiHidden="0" w:name="Medium Grid 3 Accent 6"/>
+    <w:lsdException w:qFormat="1" w:unhideWhenUsed="0" w:uiPriority="70" w:semiHidden="0" w:name="Dark List Accent 6"/>
     <w:lsdException w:unhideWhenUsed="0" w:uiPriority="71" w:semiHidden="0" w:name="Colorful Shading Accent 6"/>
     <w:lsdException w:unhideWhenUsed="0" w:uiPriority="72" w:semiHidden="0" w:name="Colorful List Accent 6"/>
     <w:lsdException w:unhideWhenUsed="0" w:uiPriority="73" w:semiHidden="0" w:name="Colorful Grid Accent 6"/>
@@ -1414,6 +1428,7 @@
     <w:basedOn w:val="1"/>
     <w:link w:val="144"/>
     <w:unhideWhenUsed/>
+    <w:qFormat/>
     <w:uiPriority w:val="99"/>
     <w:pPr>
       <w:spacing w:after="120"/>
@@ -1434,6 +1449,7 @@
     <w:basedOn w:val="1"/>
     <w:link w:val="146"/>
     <w:unhideWhenUsed/>
+    <w:qFormat/>
     <w:uiPriority w:val="99"/>
     <w:pPr>
       <w:spacing w:after="120"/>
@@ -1511,6 +1527,7 @@
     <w:name w:val="List"/>
     <w:basedOn w:val="1"/>
     <w:unhideWhenUsed/>
+    <w:qFormat/>
     <w:uiPriority w:val="99"/>
     <w:pPr>
       <w:ind w:left="360" w:hanging="360"/>
@@ -1521,6 +1538,7 @@
     <w:name w:val="List 2"/>
     <w:basedOn w:val="1"/>
     <w:unhideWhenUsed/>
+    <w:qFormat/>
     <w:uiPriority w:val="99"/>
     <w:pPr>
       <w:ind w:left="720" w:hanging="360"/>
@@ -1531,6 +1549,7 @@
     <w:name w:val="List 3"/>
     <w:basedOn w:val="1"/>
     <w:unhideWhenUsed/>
+    <w:qFormat/>
     <w:uiPriority w:val="99"/>
     <w:pPr>
       <w:ind w:left="1080" w:hanging="360"/>
@@ -1541,6 +1560,7 @@
     <w:name w:val="List Bullet"/>
     <w:basedOn w:val="1"/>
     <w:unhideWhenUsed/>
+    <w:qFormat/>
     <w:uiPriority w:val="99"/>
     <w:pPr>
       <w:numPr>
@@ -1554,6 +1574,7 @@
     <w:name w:val="List Bullet 2"/>
     <w:basedOn w:val="1"/>
     <w:unhideWhenUsed/>
+    <w:qFormat/>
     <w:uiPriority w:val="99"/>
     <w:pPr>
       <w:numPr>
@@ -1567,6 +1588,7 @@
     <w:name w:val="List Bullet 3"/>
     <w:basedOn w:val="1"/>
     <w:unhideWhenUsed/>
+    <w:qFormat/>
     <w:uiPriority w:val="99"/>
     <w:pPr>
       <w:numPr>
@@ -1580,6 +1602,7 @@
     <w:name w:val="List Continue"/>
     <w:basedOn w:val="1"/>
     <w:unhideWhenUsed/>
+    <w:qFormat/>
     <w:uiPriority w:val="99"/>
     <w:pPr>
       <w:spacing w:after="120"/>
@@ -1591,6 +1614,7 @@
     <w:name w:val="List Continue 2"/>
     <w:basedOn w:val="1"/>
     <w:unhideWhenUsed/>
+    <w:qFormat/>
     <w:uiPriority w:val="99"/>
     <w:pPr>
       <w:spacing w:after="120"/>
@@ -1602,6 +1626,7 @@
     <w:name w:val="List Continue 3"/>
     <w:basedOn w:val="1"/>
     <w:unhideWhenUsed/>
+    <w:qFormat/>
     <w:uiPriority w:val="99"/>
     <w:pPr>
       <w:spacing w:after="120"/>
@@ -1626,6 +1651,7 @@
     <w:name w:val="List Number 2"/>
     <w:basedOn w:val="1"/>
     <w:unhideWhenUsed/>
+    <w:qFormat/>
     <w:uiPriority w:val="99"/>
     <w:pPr>
       <w:numPr>
@@ -3098,6 +3124,7 @@
   <w:style w:type="table" w:styleId="51">
     <w:name w:val="Light Grid"/>
     <w:basedOn w:val="12"/>
+    <w:qFormat/>
     <w:uiPriority w:val="62"/>
     <w:pPr>
       <w:spacing w:after="0" w:line="240" w:lineRule="auto"/>
@@ -3224,6 +3251,7 @@
   <w:style w:type="table" w:styleId="52">
     <w:name w:val="Light Grid Accent 1"/>
     <w:basedOn w:val="12"/>
+    <w:qFormat/>
     <w:uiPriority w:val="62"/>
     <w:pPr>
       <w:spacing w:after="0" w:line="240" w:lineRule="auto"/>
@@ -3350,6 +3378,7 @@
   <w:style w:type="table" w:styleId="53">
     <w:name w:val="Light Grid Accent 2"/>
     <w:basedOn w:val="12"/>
+    <w:qFormat/>
     <w:uiPriority w:val="62"/>
     <w:pPr>
       <w:spacing w:after="0" w:line="240" w:lineRule="auto"/>
@@ -3476,6 +3505,7 @@
   <w:style w:type="table" w:styleId="54">
     <w:name w:val="Light Grid Accent 3"/>
     <w:basedOn w:val="12"/>
+    <w:qFormat/>
     <w:uiPriority w:val="62"/>
     <w:pPr>
       <w:spacing w:after="0" w:line="240" w:lineRule="auto"/>
@@ -3602,6 +3632,7 @@
   <w:style w:type="table" w:styleId="55">
     <w:name w:val="Light Grid Accent 4"/>
     <w:basedOn w:val="12"/>
+    <w:qFormat/>
     <w:uiPriority w:val="62"/>
     <w:pPr>
       <w:spacing w:after="0" w:line="240" w:lineRule="auto"/>
@@ -3728,6 +3759,7 @@
   <w:style w:type="table" w:styleId="56">
     <w:name w:val="Light Grid Accent 5"/>
     <w:basedOn w:val="12"/>
+    <w:qFormat/>
     <w:uiPriority w:val="62"/>
     <w:pPr>
       <w:spacing w:after="0" w:line="240" w:lineRule="auto"/>
@@ -3854,6 +3886,7 @@
   <w:style w:type="table" w:styleId="57">
     <w:name w:val="Light Grid Accent 6"/>
     <w:basedOn w:val="12"/>
+    <w:qFormat/>
     <w:uiPriority w:val="62"/>
     <w:pPr>
       <w:spacing w:after="0" w:line="240" w:lineRule="auto"/>
@@ -4087,6 +4120,7 @@
   <w:style w:type="table" w:styleId="59">
     <w:name w:val="Medium Shading 1 Accent 1"/>
     <w:basedOn w:val="12"/>
+    <w:qFormat/>
     <w:uiPriority w:val="63"/>
     <w:pPr>
       <w:spacing w:after="0" w:line="240" w:lineRule="auto"/>
@@ -4194,6 +4228,7 @@
   <w:style w:type="table" w:styleId="60">
     <w:name w:val="Medium Shading 1 Accent 2"/>
     <w:basedOn w:val="12"/>
+    <w:qFormat/>
     <w:uiPriority w:val="63"/>
     <w:pPr>
       <w:spacing w:after="0" w:line="240" w:lineRule="auto"/>
@@ -4301,6 +4336,7 @@
   <w:style w:type="table" w:styleId="61">
     <w:name w:val="Medium Shading 1 Accent 3"/>
     <w:basedOn w:val="12"/>
+    <w:qFormat/>
     <w:uiPriority w:val="63"/>
     <w:pPr>
       <w:spacing w:after="0" w:line="240" w:lineRule="auto"/>
@@ -4408,6 +4444,7 @@
   <w:style w:type="table" w:styleId="62">
     <w:name w:val="Medium Shading 1 Accent 4"/>
     <w:basedOn w:val="12"/>
+    <w:qFormat/>
     <w:uiPriority w:val="63"/>
     <w:pPr>
       <w:spacing w:after="0" w:line="240" w:lineRule="auto"/>
@@ -4515,6 +4552,7 @@
   <w:style w:type="table" w:styleId="63">
     <w:name w:val="Medium Shading 1 Accent 5"/>
     <w:basedOn w:val="12"/>
+    <w:qFormat/>
     <w:uiPriority w:val="63"/>
     <w:pPr>
       <w:spacing w:after="0" w:line="240" w:lineRule="auto"/>
@@ -4622,6 +4660,7 @@
   <w:style w:type="table" w:styleId="64">
     <w:name w:val="Medium Shading 1 Accent 6"/>
     <w:basedOn w:val="12"/>
+    <w:qFormat/>
     <w:uiPriority w:val="63"/>
     <w:pPr>
       <w:spacing w:after="0" w:line="240" w:lineRule="auto"/>
@@ -4894,6 +4933,7 @@
   <w:style w:type="table" w:styleId="66">
     <w:name w:val="Medium Shading 2 Accent 1"/>
     <w:basedOn w:val="12"/>
+    <w:qFormat/>
     <w:uiPriority w:val="64"/>
     <w:pPr>
       <w:spacing w:after="0" w:line="240" w:lineRule="auto"/>
@@ -5224,6 +5264,7 @@
   <w:style w:type="table" w:styleId="68">
     <w:name w:val="Medium Shading 2 Accent 3"/>
     <w:basedOn w:val="12"/>
+    <w:qFormat/>
     <w:uiPriority w:val="64"/>
     <w:pPr>
       <w:spacing w:after="0" w:line="240" w:lineRule="auto"/>
@@ -5389,6 +5430,7 @@
   <w:style w:type="table" w:styleId="69">
     <w:name w:val="Medium Shading 2 Accent 4"/>
     <w:basedOn w:val="12"/>
+    <w:qFormat/>
     <w:uiPriority w:val="64"/>
     <w:pPr>
       <w:spacing w:after="0" w:line="240" w:lineRule="auto"/>
@@ -5554,6 +5596,7 @@
   <w:style w:type="table" w:styleId="70">
     <w:name w:val="Medium Shading 2 Accent 5"/>
     <w:basedOn w:val="12"/>
+    <w:qFormat/>
     <w:uiPriority w:val="64"/>
     <w:pPr>
       <w:spacing w:after="0" w:line="240" w:lineRule="auto"/>
@@ -5974,6 +6017,7 @@
   <w:style w:type="table" w:styleId="73">
     <w:name w:val="Medium List 1 Accent 1"/>
     <w:basedOn w:val="12"/>
+    <w:qFormat/>
     <w:uiPriority w:val="65"/>
     <w:pPr>
       <w:spacing w:after="0" w:line="240" w:lineRule="auto"/>
@@ -6154,6 +6198,7 @@
   <w:style w:type="table" w:styleId="75">
     <w:name w:val="Medium List 1 Accent 3"/>
     <w:basedOn w:val="12"/>
+    <w:qFormat/>
     <w:uiPriority w:val="65"/>
     <w:pPr>
       <w:spacing w:after="0" w:line="240" w:lineRule="auto"/>
@@ -6643,6 +6688,7 @@
   <w:style w:type="table" w:styleId="80">
     <w:name w:val="Medium List 2 Accent 1"/>
     <w:basedOn w:val="12"/>
+    <w:qFormat/>
     <w:uiPriority w:val="66"/>
     <w:pPr>
       <w:spacing w:after="0" w:line="240" w:lineRule="auto"/>
@@ -7159,6 +7205,7 @@
   <w:style w:type="table" w:styleId="84">
     <w:name w:val="Medium List 2 Accent 5"/>
     <w:basedOn w:val="12"/>
+    <w:qFormat/>
     <w:uiPriority w:val="66"/>
     <w:pPr>
       <w:spacing w:after="0" w:line="240" w:lineRule="auto"/>
@@ -7288,6 +7335,7 @@
   <w:style w:type="table" w:styleId="85">
     <w:name w:val="Medium List 2 Accent 6"/>
     <w:basedOn w:val="12"/>
+    <w:qFormat/>
     <w:uiPriority w:val="66"/>
     <w:pPr>
       <w:spacing w:after="0" w:line="240" w:lineRule="auto"/>
@@ -7417,6 +7465,7 @@
   <w:style w:type="table" w:styleId="86">
     <w:name w:val="Medium Grid 1"/>
     <w:basedOn w:val="12"/>
+    <w:qFormat/>
     <w:uiPriority w:val="67"/>
     <w:pPr>
       <w:spacing w:after="0" w:line="240" w:lineRule="auto"/>
@@ -7555,6 +7604,7 @@
   <w:style w:type="table" w:styleId="88">
     <w:name w:val="Medium Grid 1 Accent 2"/>
     <w:basedOn w:val="12"/>
+    <w:qFormat/>
     <w:uiPriority w:val="67"/>
     <w:pPr>
       <w:spacing w:after="0" w:line="240" w:lineRule="auto"/>
@@ -7624,6 +7674,7 @@
   <w:style w:type="table" w:styleId="89">
     <w:name w:val="Medium Grid 1 Accent 3"/>
     <w:basedOn w:val="12"/>
+    <w:qFormat/>
     <w:uiPriority w:val="67"/>
     <w:pPr>
       <w:spacing w:after="0" w:line="240" w:lineRule="auto"/>
@@ -7831,6 +7882,7 @@
   <w:style w:type="table" w:styleId="92">
     <w:name w:val="Medium Grid 1 Accent 6"/>
     <w:basedOn w:val="12"/>
+    <w:qFormat/>
     <w:uiPriority w:val="67"/>
     <w:pPr>
       <w:spacing w:after="0" w:line="240" w:lineRule="auto"/>
@@ -7900,6 +7952,7 @@
   <w:style w:type="table" w:styleId="93">
     <w:name w:val="Medium Grid 2"/>
     <w:basedOn w:val="12"/>
+    <w:qFormat/>
     <w:uiPriority w:val="68"/>
     <w:pPr>
       <w:spacing w:after="0" w:line="240" w:lineRule="auto"/>
@@ -8046,6 +8099,7 @@
   <w:style w:type="table" w:styleId="94">
     <w:name w:val="Medium Grid 2 Accent 1"/>
     <w:basedOn w:val="12"/>
+    <w:qFormat/>
     <w:uiPriority w:val="68"/>
     <w:pPr>
       <w:spacing w:after="0" w:line="240" w:lineRule="auto"/>
@@ -8484,6 +8538,7 @@
   <w:style w:type="table" w:styleId="97">
     <w:name w:val="Medium Grid 2 Accent 4"/>
     <w:basedOn w:val="12"/>
+    <w:qFormat/>
     <w:uiPriority w:val="68"/>
     <w:pPr>
       <w:spacing w:after="0" w:line="240" w:lineRule="auto"/>
@@ -8776,6 +8831,7 @@
   <w:style w:type="table" w:styleId="99">
     <w:name w:val="Medium Grid 2 Accent 6"/>
     <w:basedOn w:val="12"/>
+    <w:qFormat/>
     <w:uiPriority w:val="68"/>
     <w:pPr>
       <w:spacing w:after="0" w:line="240" w:lineRule="auto"/>
@@ -9079,6 +9135,7 @@
   <w:style w:type="table" w:styleId="101">
     <w:name w:val="Medium Grid 3 Accent 1"/>
     <w:basedOn w:val="12"/>
+    <w:qFormat/>
     <w:uiPriority w:val="69"/>
     <w:pPr>
       <w:spacing w:after="0" w:line="240" w:lineRule="auto"/>
@@ -9393,6 +9450,7 @@
   <w:style w:type="table" w:styleId="103">
     <w:name w:val="Medium Grid 3 Accent 3"/>
     <w:basedOn w:val="12"/>
+    <w:qFormat/>
     <w:uiPriority w:val="69"/>
     <w:pPr>
       <w:spacing w:after="0" w:line="240" w:lineRule="auto"/>
@@ -9707,6 +9765,7 @@
   <w:style w:type="table" w:styleId="105">
     <w:name w:val="Medium Grid 3 Accent 5"/>
     <w:basedOn w:val="12"/>
+    <w:qFormat/>
     <w:uiPriority w:val="69"/>
     <w:pPr>
       <w:spacing w:after="0" w:line="240" w:lineRule="auto"/>
@@ -9864,6 +9923,7 @@
   <w:style w:type="table" w:styleId="106">
     <w:name w:val="Medium Grid 3 Accent 6"/>
     <w:basedOn w:val="12"/>
+    <w:qFormat/>
     <w:uiPriority w:val="69"/>
     <w:pPr>
       <w:spacing w:after="0" w:line="240" w:lineRule="auto"/>
@@ -10021,6 +10081,7 @@
   <w:style w:type="table" w:styleId="107">
     <w:name w:val="Dark List"/>
     <w:basedOn w:val="12"/>
+    <w:qFormat/>
     <w:uiPriority w:val="70"/>
     <w:pPr>
       <w:spacing w:after="0" w:line="240" w:lineRule="auto"/>
@@ -10711,6 +10772,7 @@
   <w:style w:type="table" w:styleId="113">
     <w:name w:val="Dark List Accent 6"/>
     <w:basedOn w:val="12"/>
+    <w:qFormat/>
     <w:uiPriority w:val="70"/>
     <w:pPr>
       <w:spacing w:after="0" w:line="240" w:lineRule="auto"/>
@@ -10826,6 +10888,7 @@
   <w:style w:type="table" w:styleId="114">
     <w:name w:val="Colorful Shading"/>
     <w:basedOn w:val="12"/>
+    <w:qFormat/>
     <w:uiPriority w:val="71"/>
     <w:pPr>
       <w:spacing w:after="0" w:line="240" w:lineRule="auto"/>
@@ -11270,6 +11333,7 @@
   <w:style w:type="table" w:styleId="117">
     <w:name w:val="Colorful Shading Accent 3"/>
     <w:basedOn w:val="12"/>
+    <w:qFormat/>
     <w:uiPriority w:val="71"/>
     <w:pPr>
       <w:spacing w:after="0" w:line="240" w:lineRule="auto"/>
@@ -11842,6 +11906,7 @@
   <w:style w:type="table" w:styleId="121">
     <w:name w:val="Colorful List"/>
     <w:basedOn w:val="12"/>
+    <w:qFormat/>
     <w:uiPriority w:val="72"/>
     <w:pPr>
       <w:spacing w:after="0" w:line="240" w:lineRule="auto"/>
@@ -12210,6 +12275,7 @@
   <w:style w:type="table" w:styleId="125">
     <w:name w:val="Colorful List Accent 4"/>
     <w:basedOn w:val="12"/>
+    <w:qFormat/>
     <w:uiPriority w:val="72"/>
     <w:pPr>
       <w:spacing w:after="0" w:line="240" w:lineRule="auto"/>
@@ -12302,6 +12368,7 @@
   <w:style w:type="table" w:styleId="126">
     <w:name w:val="Colorful List Accent 5"/>
     <w:basedOn w:val="12"/>
+    <w:qFormat/>
     <w:uiPriority w:val="72"/>
     <w:pPr>
       <w:spacing w:after="0" w:line="240" w:lineRule="auto"/>
@@ -12582,6 +12649,7 @@
   <w:style w:type="table" w:styleId="129">
     <w:name w:val="Colorful Grid Accent 1"/>
     <w:basedOn w:val="12"/>
+    <w:qFormat/>
     <w:uiPriority w:val="73"/>
     <w:pPr>
       <w:spacing w:after="0" w:line="240" w:lineRule="auto"/>
@@ -12678,6 +12746,7 @@
   <w:style w:type="table" w:styleId="130">
     <w:name w:val="Colorful Grid Accent 2"/>
     <w:basedOn w:val="12"/>
+    <w:qFormat/>
     <w:uiPriority w:val="73"/>
     <w:pPr>
       <w:spacing w:after="0" w:line="240" w:lineRule="auto"/>
@@ -12774,6 +12843,7 @@
   <w:style w:type="table" w:styleId="131">
     <w:name w:val="Colorful Grid Accent 3"/>
     <w:basedOn w:val="12"/>
+    <w:qFormat/>
     <w:uiPriority w:val="73"/>
     <w:pPr>
       <w:spacing w:after="0" w:line="240" w:lineRule="auto"/>
@@ -12870,6 +12940,7 @@
   <w:style w:type="table" w:styleId="132">
     <w:name w:val="Colorful Grid Accent 4"/>
     <w:basedOn w:val="12"/>
+    <w:qFormat/>
     <w:uiPriority w:val="73"/>
     <w:pPr>
       <w:spacing w:after="0" w:line="240" w:lineRule="auto"/>
@@ -13187,6 +13258,7 @@
     <w:name w:val="Heading 1 Char"/>
     <w:basedOn w:val="11"/>
     <w:link w:val="2"/>
+    <w:qFormat/>
     <w:uiPriority w:val="9"/>
     <w:rPr>
       <w:rFonts w:asciiTheme="majorHAnsi" w:hAnsiTheme="majorHAnsi" w:eastAsiaTheme="majorEastAsia" w:cstheme="majorBidi"/>
@@ -13201,6 +13273,7 @@
     <w:name w:val="Heading 2 Char"/>
     <w:basedOn w:val="11"/>
     <w:link w:val="3"/>
+    <w:qFormat/>
     <w:uiPriority w:val="9"/>
     <w:rPr>
       <w:rFonts w:asciiTheme="majorHAnsi" w:hAnsiTheme="majorHAnsi" w:eastAsiaTheme="majorEastAsia" w:cstheme="majorBidi"/>
@@ -13220,6 +13293,7 @@
     <w:name w:val="Heading 3 Char"/>
     <w:basedOn w:val="11"/>
     <w:link w:val="4"/>
+    <w:qFormat/>
     <w:uiPriority w:val="9"/>
     <w:rPr>
       <w:rFonts w:asciiTheme="majorHAnsi" w:hAnsiTheme="majorHAnsi" w:eastAsiaTheme="majorEastAsia" w:cstheme="majorBidi"/>
@@ -13287,12 +13361,14 @@
     <w:name w:val="Body Text 2 Char"/>
     <w:basedOn w:val="11"/>
     <w:link w:val="14"/>
+    <w:qFormat/>
     <w:uiPriority w:val="99"/>
   </w:style>
   <w:style w:type="character" w:customStyle="1" w:styleId="146">
     <w:name w:val="Body Text 3 Char"/>
     <w:basedOn w:val="11"/>
     <w:link w:val="15"/>
+    <w:qFormat/>
     <w:uiPriority w:val="99"/>
     <w:rPr>
       <w:sz w:val="16"/>
@@ -13303,6 +13379,7 @@
     <w:name w:val="Macro Text Char"/>
     <w:basedOn w:val="11"/>
     <w:link w:val="32"/>
+    <w:qFormat/>
     <w:uiPriority w:val="99"/>
     <w:rPr>
       <w:rFonts w:ascii="Courier" w:hAnsi="Courier"/>
@@ -13349,6 +13426,7 @@
     <w:basedOn w:val="11"/>
     <w:link w:val="5"/>
     <w:semiHidden/>
+    <w:qFormat/>
     <w:uiPriority w:val="9"/>
     <w:rPr>
       <w:rFonts w:asciiTheme="majorHAnsi" w:hAnsiTheme="majorHAnsi" w:eastAsiaTheme="majorEastAsia" w:cstheme="majorBidi"/>
@@ -13369,6 +13447,7 @@
     <w:basedOn w:val="11"/>
     <w:link w:val="6"/>
     <w:semiHidden/>
+    <w:qFormat/>
     <w:uiPriority w:val="9"/>
     <w:rPr>
       <w:rFonts w:asciiTheme="majorHAnsi" w:hAnsiTheme="majorHAnsi" w:eastAsiaTheme="majorEastAsia" w:cstheme="majorBidi"/>
@@ -13393,6 +13472,7 @@
     <w:basedOn w:val="11"/>
     <w:link w:val="8"/>
     <w:semiHidden/>
+    <w:qFormat/>
     <w:uiPriority w:val="9"/>
     <w:rPr>
       <w:rFonts w:asciiTheme="majorHAnsi" w:hAnsiTheme="majorHAnsi" w:eastAsiaTheme="majorEastAsia" w:cstheme="majorBidi"/>
@@ -13432,6 +13512,7 @@
     <w:basedOn w:val="11"/>
     <w:link w:val="10"/>
     <w:semiHidden/>
+    <w:qFormat/>
     <w:uiPriority w:val="9"/>
     <w:rPr>
       <w:rFonts w:asciiTheme="majorHAnsi" w:hAnsiTheme="majorHAnsi" w:eastAsiaTheme="majorEastAsia" w:cstheme="majorBidi"/>

</xml_diff>

<commit_message>
Update Bui_Cao_Nguyen_Resume_Yale.docx in root and public folder
</commit_message>
<xml_diff>
--- a/public/Bui_Cao_Nguyen_Resume_Yale.docx
+++ b/public/Bui_Cao_Nguyen_Resume_Yale.docx
@@ -38,7 +38,7 @@
         <w:rPr>
           <w:sz w:val="19"/>
         </w:rPr>
-        <w:t>Ho Chi Minh City, Vietnam  |  0944015003  |  buicaonguyen115@</w:t>
+        <w:t>Ho Chi Minh City, Vietnam  |  0944015003  |  buicaonguyen115</w:t>
       </w:r>
       <w:r>
         <w:rPr>
@@ -189,10 +189,6 @@
           <w:tab w:val="right" w:pos="10512"/>
         </w:tabs>
         <w:spacing w:before="0" w:after="20"/>
-        <w:rPr>
-          <w:rFonts w:hint="default"/>
-          <w:lang w:val="en-US"/>
-        </w:rPr>
       </w:pPr>
       <w:r>
         <w:rPr>
@@ -207,54 +203,11 @@
       </w:r>
       <w:r>
         <w:rPr>
-          <w:rFonts w:hint="default"/>
-          <w:b/>
-          <w:bCs/>
-          <w:i/>
-          <w:iCs/>
-          <w:lang w:val="en-US"/>
-        </w:rPr>
-        <w:t>Sep</w:t>
-      </w:r>
-      <w:r>
-        <w:rPr>
-          <w:b/>
-          <w:bCs/>
-          <w:i/>
-          <w:iCs/>
-          <w:sz w:val="19"/>
-        </w:rPr>
-        <w:t xml:space="preserve"> 202</w:t>
-      </w:r>
-      <w:r>
-        <w:rPr>
-          <w:rFonts w:hint="default"/>
-          <w:b/>
-          <w:bCs/>
-          <w:i/>
-          <w:iCs/>
-          <w:sz w:val="19"/>
-          <w:lang w:val="en-US"/>
-        </w:rPr>
-        <w:t>5</w:t>
-      </w:r>
-      <w:r>
-        <w:rPr>
           <w:b/>
           <w:i/>
           <w:sz w:val="19"/>
         </w:rPr>
-        <w:t xml:space="preserve"> – </w:t>
-      </w:r>
-      <w:r>
-        <w:rPr>
-          <w:rFonts w:hint="default"/>
-          <w:b/>
-          <w:i/>
-          <w:sz w:val="19"/>
-          <w:lang w:val="en-US"/>
-        </w:rPr>
-        <w:t>Present</w:t>
+        <w:t>Apr 2026 – Aug 2026</w:t>
       </w:r>
     </w:p>
     <w:p>
@@ -356,39 +309,11 @@
       </w:r>
       <w:r>
         <w:rPr>
-          <w:rFonts w:hint="default"/>
-          <w:b/>
-          <w:i/>
-          <w:sz w:val="19"/>
-          <w:lang w:val="en-US"/>
-        </w:rPr>
-        <w:t>Mar</w:t>
-      </w:r>
-      <w:r>
-        <w:rPr>
           <w:b/>
           <w:i/>
           <w:sz w:val="19"/>
         </w:rPr>
-        <w:t xml:space="preserve"> 2025 – </w:t>
-      </w:r>
-      <w:r>
-        <w:rPr>
-          <w:rFonts w:hint="default"/>
-          <w:b/>
-          <w:i/>
-          <w:sz w:val="19"/>
-          <w:lang w:val="en-US"/>
-        </w:rPr>
-        <w:t>Sep</w:t>
-      </w:r>
-      <w:r>
-        <w:rPr>
-          <w:b/>
-          <w:i/>
-          <w:sz w:val="19"/>
-        </w:rPr>
-        <w:t xml:space="preserve"> 2025</w:t>
+        <w:t>Oct 2025 – Dec 2025</w:t>
       </w:r>
     </w:p>
     <w:p>
@@ -944,18 +869,18 @@
     <w:lsdException w:uiPriority="99" w:name="table of authorities"/>
     <w:lsdException w:uiPriority="99" w:semiHidden="0" w:name="macro"/>
     <w:lsdException w:uiPriority="99" w:name="toa heading"/>
-    <w:lsdException w:qFormat="1" w:uiPriority="99" w:semiHidden="0" w:name="List"/>
-    <w:lsdException w:qFormat="1" w:uiPriority="99" w:semiHidden="0" w:name="List Bullet"/>
+    <w:lsdException w:uiPriority="99" w:semiHidden="0" w:name="List"/>
+    <w:lsdException w:uiPriority="99" w:semiHidden="0" w:name="List Bullet"/>
     <w:lsdException w:uiPriority="99" w:semiHidden="0" w:name="List Number"/>
-    <w:lsdException w:qFormat="1" w:uiPriority="99" w:semiHidden="0" w:name="List 2"/>
-    <w:lsdException w:qFormat="1" w:uiPriority="99" w:semiHidden="0" w:name="List 3"/>
+    <w:lsdException w:uiPriority="99" w:semiHidden="0" w:name="List 2"/>
+    <w:lsdException w:uiPriority="99" w:semiHidden="0" w:name="List 3"/>
     <w:lsdException w:uiPriority="99" w:name="List 4"/>
     <w:lsdException w:uiPriority="99" w:name="List 5"/>
-    <w:lsdException w:qFormat="1" w:uiPriority="99" w:semiHidden="0" w:name="List Bullet 2"/>
-    <w:lsdException w:qFormat="1" w:uiPriority="99" w:semiHidden="0" w:name="List Bullet 3"/>
+    <w:lsdException w:uiPriority="99" w:semiHidden="0" w:name="List Bullet 2"/>
+    <w:lsdException w:uiPriority="99" w:semiHidden="0" w:name="List Bullet 3"/>
     <w:lsdException w:uiPriority="99" w:name="List Bullet 4"/>
     <w:lsdException w:uiPriority="99" w:name="List Bullet 5"/>
-    <w:lsdException w:qFormat="1" w:uiPriority="99" w:semiHidden="0" w:name="List Number 2"/>
+    <w:lsdException w:uiPriority="99" w:semiHidden="0" w:name="List Number 2"/>
     <w:lsdException w:uiPriority="99" w:semiHidden="0" w:name="List Number 3"/>
     <w:lsdException w:uiPriority="99" w:name="List Number 4"/>
     <w:lsdException w:uiPriority="99" w:name="List Number 5"/>
@@ -963,11 +888,11 @@
     <w:lsdException w:uiPriority="99" w:name="Closing"/>
     <w:lsdException w:uiPriority="99" w:name="Signature"/>
     <w:lsdException w:qFormat="1" w:uiPriority="1" w:name="Default Paragraph Font"/>
-    <w:lsdException w:qFormat="1" w:uiPriority="99" w:semiHidden="0" w:name="Body Text"/>
+    <w:lsdException w:uiPriority="99" w:semiHidden="0" w:name="Body Text"/>
     <w:lsdException w:uiPriority="99" w:name="Body Text Indent"/>
-    <w:lsdException w:qFormat="1" w:uiPriority="99" w:semiHidden="0" w:name="List Continue"/>
-    <w:lsdException w:qFormat="1" w:uiPriority="99" w:semiHidden="0" w:name="List Continue 2"/>
-    <w:lsdException w:qFormat="1" w:uiPriority="99" w:semiHidden="0" w:name="List Continue 3"/>
+    <w:lsdException w:uiPriority="99" w:semiHidden="0" w:name="List Continue"/>
+    <w:lsdException w:uiPriority="99" w:semiHidden="0" w:name="List Continue 2"/>
+    <w:lsdException w:uiPriority="99" w:semiHidden="0" w:name="List Continue 3"/>
     <w:lsdException w:uiPriority="99" w:name="List Continue 4"/>
     <w:lsdException w:uiPriority="99" w:name="List Continue 5"/>
     <w:lsdException w:uiPriority="99" w:name="Message Header"/>
@@ -978,7 +903,7 @@
     <w:lsdException w:uiPriority="99" w:name="Body Text First Indent 2"/>
     <w:lsdException w:uiPriority="99" w:name="Note Heading"/>
     <w:lsdException w:uiPriority="99" w:semiHidden="0" w:name="Body Text 2"/>
-    <w:lsdException w:qFormat="1" w:uiPriority="99" w:semiHidden="0" w:name="Body Text 3"/>
+    <w:lsdException w:uiPriority="99" w:semiHidden="0" w:name="Body Text 3"/>
     <w:lsdException w:uiPriority="99" w:name="Body Text Indent 2"/>
     <w:lsdException w:uiPriority="99" w:name="Body Text Indent 3"/>
     <w:lsdException w:uiPriority="99" w:name="Block Text"/>
@@ -1000,7 +925,7 @@
     <w:lsdException w:uiPriority="99" w:name="HTML Sample"/>
     <w:lsdException w:uiPriority="99" w:name="HTML Typewriter"/>
     <w:lsdException w:uiPriority="99" w:name="HTML Variable"/>
-    <w:lsdException w:qFormat="1" w:uiPriority="99" w:name="Normal Table"/>
+    <w:lsdException w:uiPriority="99" w:name="Normal Table"/>
     <w:lsdException w:uiPriority="99" w:name="annotation subject"/>
     <w:lsdException w:uiPriority="99" w:name="Table Simple 1"/>
     <w:lsdException w:uiPriority="99" w:name="Table Simple 2"/>
@@ -1054,97 +979,97 @@
     <w:lsdException w:unhideWhenUsed="0" w:uiPriority="63" w:semiHidden="0" w:name="Medium Shading 1"/>
     <w:lsdException w:unhideWhenUsed="0" w:uiPriority="64" w:semiHidden="0" w:name="Medium Shading 2"/>
     <w:lsdException w:unhideWhenUsed="0" w:uiPriority="65" w:semiHidden="0" w:name="Medium List 1"/>
-    <w:lsdException w:unhideWhenUsed="0" w:uiPriority="66" w:semiHidden="0" w:name="Medium List 2"/>
-    <w:lsdException w:qFormat="1" w:unhideWhenUsed="0" w:uiPriority="67" w:semiHidden="0" w:name="Medium Grid 1"/>
-    <w:lsdException w:qFormat="1" w:unhideWhenUsed="0" w:uiPriority="68" w:semiHidden="0" w:name="Medium Grid 2"/>
-    <w:lsdException w:unhideWhenUsed="0" w:uiPriority="69" w:semiHidden="0" w:name="Medium Grid 3"/>
-    <w:lsdException w:qFormat="1" w:unhideWhenUsed="0" w:uiPriority="70" w:semiHidden="0" w:name="Dark List"/>
-    <w:lsdException w:qFormat="1" w:unhideWhenUsed="0" w:uiPriority="71" w:semiHidden="0" w:name="Colorful Shading"/>
-    <w:lsdException w:qFormat="1" w:unhideWhenUsed="0" w:uiPriority="72" w:semiHidden="0" w:name="Colorful List"/>
+    <w:lsdException w:qFormat="1" w:unhideWhenUsed="0" w:uiPriority="66" w:semiHidden="0" w:name="Medium List 2"/>
+    <w:lsdException w:unhideWhenUsed="0" w:uiPriority="67" w:semiHidden="0" w:name="Medium Grid 1"/>
+    <w:lsdException w:unhideWhenUsed="0" w:uiPriority="68" w:semiHidden="0" w:name="Medium Grid 2"/>
+    <w:lsdException w:qFormat="1" w:unhideWhenUsed="0" w:uiPriority="69" w:semiHidden="0" w:name="Medium Grid 3"/>
+    <w:lsdException w:unhideWhenUsed="0" w:uiPriority="70" w:semiHidden="0" w:name="Dark List"/>
+    <w:lsdException w:unhideWhenUsed="0" w:uiPriority="71" w:semiHidden="0" w:name="Colorful Shading"/>
+    <w:lsdException w:unhideWhenUsed="0" w:uiPriority="72" w:semiHidden="0" w:name="Colorful List"/>
     <w:lsdException w:unhideWhenUsed="0" w:uiPriority="73" w:semiHidden="0" w:name="Colorful Grid"/>
-    <w:lsdException w:unhideWhenUsed="0" w:uiPriority="60" w:semiHidden="0" w:name="Light Shading Accent 1"/>
+    <w:lsdException w:qFormat="1" w:unhideWhenUsed="0" w:uiPriority="60" w:semiHidden="0" w:name="Light Shading Accent 1"/>
     <w:lsdException w:unhideWhenUsed="0" w:uiPriority="61" w:semiHidden="0" w:name="Light List Accent 1"/>
     <w:lsdException w:qFormat="1" w:unhideWhenUsed="0" w:uiPriority="62" w:semiHidden="0" w:name="Light Grid Accent 1"/>
     <w:lsdException w:qFormat="1" w:unhideWhenUsed="0" w:uiPriority="63" w:semiHidden="0" w:name="Medium Shading 1 Accent 1"/>
-    <w:lsdException w:qFormat="1" w:unhideWhenUsed="0" w:uiPriority="64" w:semiHidden="0" w:name="Medium Shading 2 Accent 1"/>
+    <w:lsdException w:unhideWhenUsed="0" w:uiPriority="64" w:semiHidden="0" w:name="Medium Shading 2 Accent 1"/>
     <w:lsdException w:qFormat="1" w:unhideWhenUsed="0" w:uiPriority="65" w:semiHidden="0" w:name="Medium List 1 Accent 1"/>
     <w:lsdException w:qFormat="1" w:unhideWhenUsed="0" w:uiPriority="34" w:semiHidden="0" w:name="List Paragraph"/>
     <w:lsdException w:qFormat="1" w:unhideWhenUsed="0" w:uiPriority="29" w:semiHidden="0" w:name="Quote"/>
     <w:lsdException w:qFormat="1" w:unhideWhenUsed="0" w:uiPriority="30" w:semiHidden="0" w:name="Intense Quote"/>
-    <w:lsdException w:qFormat="1" w:unhideWhenUsed="0" w:uiPriority="66" w:semiHidden="0" w:name="Medium List 2 Accent 1"/>
-    <w:lsdException w:unhideWhenUsed="0" w:uiPriority="67" w:semiHidden="0" w:name="Medium Grid 1 Accent 1"/>
-    <w:lsdException w:qFormat="1" w:unhideWhenUsed="0" w:uiPriority="68" w:semiHidden="0" w:name="Medium Grid 2 Accent 1"/>
-    <w:lsdException w:qFormat="1" w:unhideWhenUsed="0" w:uiPriority="69" w:semiHidden="0" w:name="Medium Grid 3 Accent 1"/>
+    <w:lsdException w:unhideWhenUsed="0" w:uiPriority="66" w:semiHidden="0" w:name="Medium List 2 Accent 1"/>
+    <w:lsdException w:qFormat="1" w:unhideWhenUsed="0" w:uiPriority="67" w:semiHidden="0" w:name="Medium Grid 1 Accent 1"/>
+    <w:lsdException w:unhideWhenUsed="0" w:uiPriority="68" w:semiHidden="0" w:name="Medium Grid 2 Accent 1"/>
+    <w:lsdException w:unhideWhenUsed="0" w:uiPriority="69" w:semiHidden="0" w:name="Medium Grid 3 Accent 1"/>
     <w:lsdException w:unhideWhenUsed="0" w:uiPriority="70" w:semiHidden="0" w:name="Dark List Accent 1"/>
     <w:lsdException w:unhideWhenUsed="0" w:uiPriority="71" w:semiHidden="0" w:name="Colorful Shading Accent 1"/>
     <w:lsdException w:unhideWhenUsed="0" w:uiPriority="72" w:semiHidden="0" w:name="Colorful List Accent 1"/>
-    <w:lsdException w:qFormat="1" w:unhideWhenUsed="0" w:uiPriority="73" w:semiHidden="0" w:name="Colorful Grid Accent 1"/>
+    <w:lsdException w:unhideWhenUsed="0" w:uiPriority="73" w:semiHidden="0" w:name="Colorful Grid Accent 1"/>
     <w:lsdException w:unhideWhenUsed="0" w:uiPriority="60" w:semiHidden="0" w:name="Light Shading Accent 2"/>
-    <w:lsdException w:unhideWhenUsed="0" w:uiPriority="61" w:semiHidden="0" w:name="Light List Accent 2"/>
+    <w:lsdException w:qFormat="1" w:unhideWhenUsed="0" w:uiPriority="61" w:semiHidden="0" w:name="Light List Accent 2"/>
     <w:lsdException w:qFormat="1" w:unhideWhenUsed="0" w:uiPriority="62" w:semiHidden="0" w:name="Light Grid Accent 2"/>
-    <w:lsdException w:qFormat="1" w:unhideWhenUsed="0" w:uiPriority="63" w:semiHidden="0" w:name="Medium Shading 1 Accent 2"/>
+    <w:lsdException w:unhideWhenUsed="0" w:uiPriority="63" w:semiHidden="0" w:name="Medium Shading 1 Accent 2"/>
     <w:lsdException w:unhideWhenUsed="0" w:uiPriority="64" w:semiHidden="0" w:name="Medium Shading 2 Accent 2"/>
     <w:lsdException w:unhideWhenUsed="0" w:uiPriority="65" w:semiHidden="0" w:name="Medium List 1 Accent 2"/>
-    <w:lsdException w:unhideWhenUsed="0" w:uiPriority="66" w:semiHidden="0" w:name="Medium List 2 Accent 2"/>
-    <w:lsdException w:qFormat="1" w:unhideWhenUsed="0" w:uiPriority="67" w:semiHidden="0" w:name="Medium Grid 1 Accent 2"/>
+    <w:lsdException w:qFormat="1" w:unhideWhenUsed="0" w:uiPriority="66" w:semiHidden="0" w:name="Medium List 2 Accent 2"/>
+    <w:lsdException w:unhideWhenUsed="0" w:uiPriority="67" w:semiHidden="0" w:name="Medium Grid 1 Accent 2"/>
     <w:lsdException w:unhideWhenUsed="0" w:uiPriority="68" w:semiHidden="0" w:name="Medium Grid 2 Accent 2"/>
     <w:lsdException w:unhideWhenUsed="0" w:uiPriority="69" w:semiHidden="0" w:name="Medium Grid 3 Accent 2"/>
     <w:lsdException w:unhideWhenUsed="0" w:uiPriority="70" w:semiHidden="0" w:name="Dark List Accent 2"/>
     <w:lsdException w:unhideWhenUsed="0" w:uiPriority="71" w:semiHidden="0" w:name="Colorful Shading Accent 2"/>
     <w:lsdException w:unhideWhenUsed="0" w:uiPriority="72" w:semiHidden="0" w:name="Colorful List Accent 2"/>
-    <w:lsdException w:qFormat="1" w:unhideWhenUsed="0" w:uiPriority="73" w:semiHidden="0" w:name="Colorful Grid Accent 2"/>
+    <w:lsdException w:unhideWhenUsed="0" w:uiPriority="73" w:semiHidden="0" w:name="Colorful Grid Accent 2"/>
     <w:lsdException w:unhideWhenUsed="0" w:uiPriority="60" w:semiHidden="0" w:name="Light Shading Accent 3"/>
-    <w:lsdException w:unhideWhenUsed="0" w:uiPriority="61" w:semiHidden="0" w:name="Light List Accent 3"/>
+    <w:lsdException w:qFormat="1" w:unhideWhenUsed="0" w:uiPriority="61" w:semiHidden="0" w:name="Light List Accent 3"/>
     <w:lsdException w:qFormat="1" w:unhideWhenUsed="0" w:uiPriority="62" w:semiHidden="0" w:name="Light Grid Accent 3"/>
-    <w:lsdException w:qFormat="1" w:unhideWhenUsed="0" w:uiPriority="63" w:semiHidden="0" w:name="Medium Shading 1 Accent 3"/>
+    <w:lsdException w:unhideWhenUsed="0" w:uiPriority="63" w:semiHidden="0" w:name="Medium Shading 1 Accent 3"/>
     <w:lsdException w:qFormat="1" w:unhideWhenUsed="0" w:uiPriority="64" w:semiHidden="0" w:name="Medium Shading 2 Accent 3"/>
-    <w:lsdException w:qFormat="1" w:unhideWhenUsed="0" w:uiPriority="65" w:semiHidden="0" w:name="Medium List 1 Accent 3"/>
-    <w:lsdException w:unhideWhenUsed="0" w:uiPriority="66" w:semiHidden="0" w:name="Medium List 2 Accent 3"/>
+    <w:lsdException w:unhideWhenUsed="0" w:uiPriority="65" w:semiHidden="0" w:name="Medium List 1 Accent 3"/>
+    <w:lsdException w:qFormat="1" w:unhideWhenUsed="0" w:uiPriority="66" w:semiHidden="0" w:name="Medium List 2 Accent 3"/>
     <w:lsdException w:qFormat="1" w:unhideWhenUsed="0" w:uiPriority="67" w:semiHidden="0" w:name="Medium Grid 1 Accent 3"/>
     <w:lsdException w:unhideWhenUsed="0" w:uiPriority="68" w:semiHidden="0" w:name="Medium Grid 2 Accent 3"/>
     <w:lsdException w:qFormat="1" w:unhideWhenUsed="0" w:uiPriority="69" w:semiHidden="0" w:name="Medium Grid 3 Accent 3"/>
     <w:lsdException w:unhideWhenUsed="0" w:uiPriority="70" w:semiHidden="0" w:name="Dark List Accent 3"/>
-    <w:lsdException w:qFormat="1" w:unhideWhenUsed="0" w:uiPriority="71" w:semiHidden="0" w:name="Colorful Shading Accent 3"/>
+    <w:lsdException w:unhideWhenUsed="0" w:uiPriority="71" w:semiHidden="0" w:name="Colorful Shading Accent 3"/>
     <w:lsdException w:unhideWhenUsed="0" w:uiPriority="72" w:semiHidden="0" w:name="Colorful List Accent 3"/>
-    <w:lsdException w:qFormat="1" w:unhideWhenUsed="0" w:uiPriority="73" w:semiHidden="0" w:name="Colorful Grid Accent 3"/>
-    <w:lsdException w:unhideWhenUsed="0" w:uiPriority="60" w:semiHidden="0" w:name="Light Shading Accent 4"/>
+    <w:lsdException w:unhideWhenUsed="0" w:uiPriority="73" w:semiHidden="0" w:name="Colorful Grid Accent 3"/>
+    <w:lsdException w:qFormat="1" w:unhideWhenUsed="0" w:uiPriority="60" w:semiHidden="0" w:name="Light Shading Accent 4"/>
     <w:lsdException w:unhideWhenUsed="0" w:uiPriority="61" w:semiHidden="0" w:name="Light List Accent 4"/>
-    <w:lsdException w:qFormat="1" w:unhideWhenUsed="0" w:uiPriority="62" w:semiHidden="0" w:name="Light Grid Accent 4"/>
-    <w:lsdException w:qFormat="1" w:unhideWhenUsed="0" w:uiPriority="63" w:semiHidden="0" w:name="Medium Shading 1 Accent 4"/>
+    <w:lsdException w:unhideWhenUsed="0" w:uiPriority="62" w:semiHidden="0" w:name="Light Grid Accent 4"/>
+    <w:lsdException w:unhideWhenUsed="0" w:uiPriority="63" w:semiHidden="0" w:name="Medium Shading 1 Accent 4"/>
     <w:lsdException w:qFormat="1" w:unhideWhenUsed="0" w:uiPriority="64" w:semiHidden="0" w:name="Medium Shading 2 Accent 4"/>
     <w:lsdException w:unhideWhenUsed="0" w:uiPriority="65" w:semiHidden="0" w:name="Medium List 1 Accent 4"/>
-    <w:lsdException w:unhideWhenUsed="0" w:uiPriority="66" w:semiHidden="0" w:name="Medium List 2 Accent 4"/>
-    <w:lsdException w:unhideWhenUsed="0" w:uiPriority="67" w:semiHidden="0" w:name="Medium Grid 1 Accent 4"/>
-    <w:lsdException w:qFormat="1" w:unhideWhenUsed="0" w:uiPriority="68" w:semiHidden="0" w:name="Medium Grid 2 Accent 4"/>
+    <w:lsdException w:qFormat="1" w:unhideWhenUsed="0" w:uiPriority="66" w:semiHidden="0" w:name="Medium List 2 Accent 4"/>
+    <w:lsdException w:qFormat="1" w:unhideWhenUsed="0" w:uiPriority="67" w:semiHidden="0" w:name="Medium Grid 1 Accent 4"/>
+    <w:lsdException w:unhideWhenUsed="0" w:uiPriority="68" w:semiHidden="0" w:name="Medium Grid 2 Accent 4"/>
     <w:lsdException w:unhideWhenUsed="0" w:uiPriority="69" w:semiHidden="0" w:name="Medium Grid 3 Accent 4"/>
     <w:lsdException w:unhideWhenUsed="0" w:uiPriority="70" w:semiHidden="0" w:name="Dark List Accent 4"/>
-    <w:lsdException w:unhideWhenUsed="0" w:uiPriority="71" w:semiHidden="0" w:name="Colorful Shading Accent 4"/>
-    <w:lsdException w:qFormat="1" w:unhideWhenUsed="0" w:uiPriority="72" w:semiHidden="0" w:name="Colorful List Accent 4"/>
-    <w:lsdException w:qFormat="1" w:unhideWhenUsed="0" w:uiPriority="73" w:semiHidden="0" w:name="Colorful Grid Accent 4"/>
+    <w:lsdException w:qFormat="1" w:unhideWhenUsed="0" w:uiPriority="71" w:semiHidden="0" w:name="Colorful Shading Accent 4"/>
+    <w:lsdException w:unhideWhenUsed="0" w:uiPriority="72" w:semiHidden="0" w:name="Colorful List Accent 4"/>
+    <w:lsdException w:unhideWhenUsed="0" w:uiPriority="73" w:semiHidden="0" w:name="Colorful Grid Accent 4"/>
     <w:lsdException w:unhideWhenUsed="0" w:uiPriority="60" w:semiHidden="0" w:name="Light Shading Accent 5"/>
-    <w:lsdException w:unhideWhenUsed="0" w:uiPriority="61" w:semiHidden="0" w:name="Light List Accent 5"/>
+    <w:lsdException w:qFormat="1" w:unhideWhenUsed="0" w:uiPriority="61" w:semiHidden="0" w:name="Light List Accent 5"/>
     <w:lsdException w:qFormat="1" w:unhideWhenUsed="0" w:uiPriority="62" w:semiHidden="0" w:name="Light Grid Accent 5"/>
     <w:lsdException w:qFormat="1" w:unhideWhenUsed="0" w:uiPriority="63" w:semiHidden="0" w:name="Medium Shading 1 Accent 5"/>
-    <w:lsdException w:qFormat="1" w:unhideWhenUsed="0" w:uiPriority="64" w:semiHidden="0" w:name="Medium Shading 2 Accent 5"/>
-    <w:lsdException w:unhideWhenUsed="0" w:uiPriority="65" w:semiHidden="0" w:name="Medium List 1 Accent 5"/>
+    <w:lsdException w:unhideWhenUsed="0" w:uiPriority="64" w:semiHidden="0" w:name="Medium Shading 2 Accent 5"/>
+    <w:lsdException w:qFormat="1" w:unhideWhenUsed="0" w:uiPriority="65" w:semiHidden="0" w:name="Medium List 1 Accent 5"/>
     <w:lsdException w:qFormat="1" w:unhideWhenUsed="0" w:uiPriority="66" w:semiHidden="0" w:name="Medium List 2 Accent 5"/>
     <w:lsdException w:unhideWhenUsed="0" w:uiPriority="67" w:semiHidden="0" w:name="Medium Grid 1 Accent 5"/>
-    <w:lsdException w:unhideWhenUsed="0" w:uiPriority="68" w:semiHidden="0" w:name="Medium Grid 2 Accent 5"/>
+    <w:lsdException w:qFormat="1" w:unhideWhenUsed="0" w:uiPriority="68" w:semiHidden="0" w:name="Medium Grid 2 Accent 5"/>
     <w:lsdException w:qFormat="1" w:unhideWhenUsed="0" w:uiPriority="69" w:semiHidden="0" w:name="Medium Grid 3 Accent 5"/>
     <w:lsdException w:unhideWhenUsed="0" w:uiPriority="70" w:semiHidden="0" w:name="Dark List Accent 5"/>
     <w:lsdException w:unhideWhenUsed="0" w:uiPriority="71" w:semiHidden="0" w:name="Colorful Shading Accent 5"/>
-    <w:lsdException w:qFormat="1" w:unhideWhenUsed="0" w:uiPriority="72" w:semiHidden="0" w:name="Colorful List Accent 5"/>
+    <w:lsdException w:unhideWhenUsed="0" w:uiPriority="72" w:semiHidden="0" w:name="Colorful List Accent 5"/>
     <w:lsdException w:unhideWhenUsed="0" w:uiPriority="73" w:semiHidden="0" w:name="Colorful Grid Accent 5"/>
-    <w:lsdException w:unhideWhenUsed="0" w:uiPriority="60" w:semiHidden="0" w:name="Light Shading Accent 6"/>
+    <w:lsdException w:qFormat="1" w:unhideWhenUsed="0" w:uiPriority="60" w:semiHidden="0" w:name="Light Shading Accent 6"/>
     <w:lsdException w:unhideWhenUsed="0" w:uiPriority="61" w:semiHidden="0" w:name="Light List Accent 6"/>
-    <w:lsdException w:qFormat="1" w:unhideWhenUsed="0" w:uiPriority="62" w:semiHidden="0" w:name="Light Grid Accent 6"/>
-    <w:lsdException w:qFormat="1" w:unhideWhenUsed="0" w:uiPriority="63" w:semiHidden="0" w:name="Medium Shading 1 Accent 6"/>
-    <w:lsdException w:unhideWhenUsed="0" w:uiPriority="64" w:semiHidden="0" w:name="Medium Shading 2 Accent 6"/>
-    <w:lsdException w:unhideWhenUsed="0" w:uiPriority="65" w:semiHidden="0" w:name="Medium List 1 Accent 6"/>
-    <w:lsdException w:qFormat="1" w:unhideWhenUsed="0" w:uiPriority="66" w:semiHidden="0" w:name="Medium List 2 Accent 6"/>
-    <w:lsdException w:qFormat="1" w:unhideWhenUsed="0" w:uiPriority="67" w:semiHidden="0" w:name="Medium Grid 1 Accent 6"/>
-    <w:lsdException w:qFormat="1" w:unhideWhenUsed="0" w:uiPriority="68" w:semiHidden="0" w:name="Medium Grid 2 Accent 6"/>
-    <w:lsdException w:qFormat="1" w:unhideWhenUsed="0" w:uiPriority="69" w:semiHidden="0" w:name="Medium Grid 3 Accent 6"/>
+    <w:lsdException w:unhideWhenUsed="0" w:uiPriority="62" w:semiHidden="0" w:name="Light Grid Accent 6"/>
+    <w:lsdException w:unhideWhenUsed="0" w:uiPriority="63" w:semiHidden="0" w:name="Medium Shading 1 Accent 6"/>
+    <w:lsdException w:qFormat="1" w:unhideWhenUsed="0" w:uiPriority="64" w:semiHidden="0" w:name="Medium Shading 2 Accent 6"/>
+    <w:lsdException w:qFormat="1" w:unhideWhenUsed="0" w:uiPriority="65" w:semiHidden="0" w:name="Medium List 1 Accent 6"/>
+    <w:lsdException w:unhideWhenUsed="0" w:uiPriority="66" w:semiHidden="0" w:name="Medium List 2 Accent 6"/>
+    <w:lsdException w:unhideWhenUsed="0" w:uiPriority="67" w:semiHidden="0" w:name="Medium Grid 1 Accent 6"/>
+    <w:lsdException w:unhideWhenUsed="0" w:uiPriority="68" w:semiHidden="0" w:name="Medium Grid 2 Accent 6"/>
+    <w:lsdException w:unhideWhenUsed="0" w:uiPriority="69" w:semiHidden="0" w:name="Medium Grid 3 Accent 6"/>
     <w:lsdException w:qFormat="1" w:unhideWhenUsed="0" w:uiPriority="70" w:semiHidden="0" w:name="Dark List Accent 6"/>
     <w:lsdException w:unhideWhenUsed="0" w:uiPriority="71" w:semiHidden="0" w:name="Colorful Shading Accent 6"/>
     <w:lsdException w:unhideWhenUsed="0" w:uiPriority="72" w:semiHidden="0" w:name="Colorful List Accent 6"/>
@@ -1412,7 +1337,6 @@
     <w:name w:val="Normal Table"/>
     <w:semiHidden/>
     <w:unhideWhenUsed/>
-    <w:qFormat/>
     <w:uiPriority w:val="99"/>
     <w:tblPr>
       <w:tblCellMar>
@@ -1428,7 +1352,6 @@
     <w:basedOn w:val="1"/>
     <w:link w:val="144"/>
     <w:unhideWhenUsed/>
-    <w:qFormat/>
     <w:uiPriority w:val="99"/>
     <w:pPr>
       <w:spacing w:after="120"/>
@@ -1449,7 +1372,6 @@
     <w:basedOn w:val="1"/>
     <w:link w:val="146"/>
     <w:unhideWhenUsed/>
-    <w:qFormat/>
     <w:uiPriority w:val="99"/>
     <w:pPr>
       <w:spacing w:after="120"/>
@@ -1527,7 +1449,6 @@
     <w:name w:val="List"/>
     <w:basedOn w:val="1"/>
     <w:unhideWhenUsed/>
-    <w:qFormat/>
     <w:uiPriority w:val="99"/>
     <w:pPr>
       <w:ind w:left="360" w:hanging="360"/>
@@ -1538,7 +1459,6 @@
     <w:name w:val="List 2"/>
     <w:basedOn w:val="1"/>
     <w:unhideWhenUsed/>
-    <w:qFormat/>
     <w:uiPriority w:val="99"/>
     <w:pPr>
       <w:ind w:left="720" w:hanging="360"/>
@@ -1549,7 +1469,6 @@
     <w:name w:val="List 3"/>
     <w:basedOn w:val="1"/>
     <w:unhideWhenUsed/>
-    <w:qFormat/>
     <w:uiPriority w:val="99"/>
     <w:pPr>
       <w:ind w:left="1080" w:hanging="360"/>
@@ -1560,7 +1479,6 @@
     <w:name w:val="List Bullet"/>
     <w:basedOn w:val="1"/>
     <w:unhideWhenUsed/>
-    <w:qFormat/>
     <w:uiPriority w:val="99"/>
     <w:pPr>
       <w:numPr>
@@ -1574,7 +1492,6 @@
     <w:name w:val="List Bullet 2"/>
     <w:basedOn w:val="1"/>
     <w:unhideWhenUsed/>
-    <w:qFormat/>
     <w:uiPriority w:val="99"/>
     <w:pPr>
       <w:numPr>
@@ -1588,7 +1505,6 @@
     <w:name w:val="List Bullet 3"/>
     <w:basedOn w:val="1"/>
     <w:unhideWhenUsed/>
-    <w:qFormat/>
     <w:uiPriority w:val="99"/>
     <w:pPr>
       <w:numPr>
@@ -1602,7 +1518,6 @@
     <w:name w:val="List Continue"/>
     <w:basedOn w:val="1"/>
     <w:unhideWhenUsed/>
-    <w:qFormat/>
     <w:uiPriority w:val="99"/>
     <w:pPr>
       <w:spacing w:after="120"/>
@@ -1614,7 +1529,6 @@
     <w:name w:val="List Continue 2"/>
     <w:basedOn w:val="1"/>
     <w:unhideWhenUsed/>
-    <w:qFormat/>
     <w:uiPriority w:val="99"/>
     <w:pPr>
       <w:spacing w:after="120"/>
@@ -1626,7 +1540,6 @@
     <w:name w:val="List Continue 3"/>
     <w:basedOn w:val="1"/>
     <w:unhideWhenUsed/>
-    <w:qFormat/>
     <w:uiPriority w:val="99"/>
     <w:pPr>
       <w:spacing w:after="120"/>
@@ -1651,7 +1564,6 @@
     <w:name w:val="List Number 2"/>
     <w:basedOn w:val="1"/>
     <w:unhideWhenUsed/>
-    <w:qFormat/>
     <w:uiPriority w:val="99"/>
     <w:pPr>
       <w:numPr>
@@ -1879,6 +1791,7 @@
   <w:style w:type="table" w:styleId="38">
     <w:name w:val="Light Shading Accent 1"/>
     <w:basedOn w:val="12"/>
+    <w:qFormat/>
     <w:uiPriority w:val="60"/>
     <w:pPr>
       <w:spacing w:after="0" w:line="240" w:lineRule="auto"/>
@@ -2176,6 +2089,7 @@
   <w:style w:type="table" w:styleId="41">
     <w:name w:val="Light Shading Accent 4"/>
     <w:basedOn w:val="12"/>
+    <w:qFormat/>
     <w:uiPriority w:val="60"/>
     <w:pPr>
       <w:spacing w:after="0" w:line="240" w:lineRule="auto"/>
@@ -2374,6 +2288,7 @@
   <w:style w:type="table" w:styleId="43">
     <w:name w:val="Light Shading Accent 6"/>
     <w:basedOn w:val="12"/>
+    <w:qFormat/>
     <w:uiPriority w:val="60"/>
     <w:pPr>
       <w:spacing w:after="0" w:line="240" w:lineRule="auto"/>
@@ -2659,6 +2574,7 @@
   <w:style w:type="table" w:styleId="46">
     <w:name w:val="Light List Accent 2"/>
     <w:basedOn w:val="12"/>
+    <w:qFormat/>
     <w:uiPriority w:val="61"/>
     <w:pPr>
       <w:spacing w:after="0" w:line="240" w:lineRule="auto"/>
@@ -2752,6 +2668,7 @@
   <w:style w:type="table" w:styleId="47">
     <w:name w:val="Light List Accent 3"/>
     <w:basedOn w:val="12"/>
+    <w:qFormat/>
     <w:uiPriority w:val="61"/>
     <w:pPr>
       <w:spacing w:after="0" w:line="240" w:lineRule="auto"/>
@@ -2938,6 +2855,7 @@
   <w:style w:type="table" w:styleId="49">
     <w:name w:val="Light List Accent 5"/>
     <w:basedOn w:val="12"/>
+    <w:qFormat/>
     <w:uiPriority w:val="61"/>
     <w:pPr>
       <w:spacing w:after="0" w:line="240" w:lineRule="auto"/>
@@ -3632,7 +3550,6 @@
   <w:style w:type="table" w:styleId="55">
     <w:name w:val="Light Grid Accent 4"/>
     <w:basedOn w:val="12"/>
-    <w:qFormat/>
     <w:uiPriority w:val="62"/>
     <w:pPr>
       <w:spacing w:after="0" w:line="240" w:lineRule="auto"/>
@@ -3886,7 +3803,6 @@
   <w:style w:type="table" w:styleId="57">
     <w:name w:val="Light Grid Accent 6"/>
     <w:basedOn w:val="12"/>
-    <w:qFormat/>
     <w:uiPriority w:val="62"/>
     <w:pPr>
       <w:spacing w:after="0" w:line="240" w:lineRule="auto"/>
@@ -4228,7 +4144,6 @@
   <w:style w:type="table" w:styleId="60">
     <w:name w:val="Medium Shading 1 Accent 2"/>
     <w:basedOn w:val="12"/>
-    <w:qFormat/>
     <w:uiPriority w:val="63"/>
     <w:pPr>
       <w:spacing w:after="0" w:line="240" w:lineRule="auto"/>
@@ -4336,7 +4251,6 @@
   <w:style w:type="table" w:styleId="61">
     <w:name w:val="Medium Shading 1 Accent 3"/>
     <w:basedOn w:val="12"/>
-    <w:qFormat/>
     <w:uiPriority w:val="63"/>
     <w:pPr>
       <w:spacing w:after="0" w:line="240" w:lineRule="auto"/>
@@ -4444,7 +4358,6 @@
   <w:style w:type="table" w:styleId="62">
     <w:name w:val="Medium Shading 1 Accent 4"/>
     <w:basedOn w:val="12"/>
-    <w:qFormat/>
     <w:uiPriority w:val="63"/>
     <w:pPr>
       <w:spacing w:after="0" w:line="240" w:lineRule="auto"/>
@@ -4660,7 +4573,6 @@
   <w:style w:type="table" w:styleId="64">
     <w:name w:val="Medium Shading 1 Accent 6"/>
     <w:basedOn w:val="12"/>
-    <w:qFormat/>
     <w:uiPriority w:val="63"/>
     <w:pPr>
       <w:spacing w:after="0" w:line="240" w:lineRule="auto"/>
@@ -4933,7 +4845,6 @@
   <w:style w:type="table" w:styleId="66">
     <w:name w:val="Medium Shading 2 Accent 1"/>
     <w:basedOn w:val="12"/>
-    <w:qFormat/>
     <w:uiPriority w:val="64"/>
     <w:pPr>
       <w:spacing w:after="0" w:line="240" w:lineRule="auto"/>
@@ -5596,7 +5507,6 @@
   <w:style w:type="table" w:styleId="70">
     <w:name w:val="Medium Shading 2 Accent 5"/>
     <w:basedOn w:val="12"/>
-    <w:qFormat/>
     <w:uiPriority w:val="64"/>
     <w:pPr>
       <w:spacing w:after="0" w:line="240" w:lineRule="auto"/>
@@ -5762,6 +5672,7 @@
   <w:style w:type="table" w:styleId="71">
     <w:name w:val="Medium Shading 2 Accent 6"/>
     <w:basedOn w:val="12"/>
+    <w:qFormat/>
     <w:uiPriority w:val="64"/>
     <w:pPr>
       <w:spacing w:after="0" w:line="240" w:lineRule="auto"/>
@@ -6198,7 +6109,6 @@
   <w:style w:type="table" w:styleId="75">
     <w:name w:val="Medium List 1 Accent 3"/>
     <w:basedOn w:val="12"/>
-    <w:qFormat/>
     <w:uiPriority w:val="65"/>
     <w:pPr>
       <w:spacing w:after="0" w:line="240" w:lineRule="auto"/>
@@ -6379,6 +6289,7 @@
   <w:style w:type="table" w:styleId="77">
     <w:name w:val="Medium List 1 Accent 5"/>
     <w:basedOn w:val="12"/>
+    <w:qFormat/>
     <w:uiPriority w:val="65"/>
     <w:pPr>
       <w:spacing w:after="0" w:line="240" w:lineRule="auto"/>
@@ -6469,6 +6380,7 @@
   <w:style w:type="table" w:styleId="78">
     <w:name w:val="Medium List 1 Accent 6"/>
     <w:basedOn w:val="12"/>
+    <w:qFormat/>
     <w:uiPriority w:val="65"/>
     <w:pPr>
       <w:spacing w:after="0" w:line="240" w:lineRule="auto"/>
@@ -6559,6 +6471,7 @@
   <w:style w:type="table" w:styleId="79">
     <w:name w:val="Medium List 2"/>
     <w:basedOn w:val="12"/>
+    <w:qFormat/>
     <w:uiPriority w:val="66"/>
     <w:pPr>
       <w:spacing w:after="0" w:line="240" w:lineRule="auto"/>
@@ -6688,7 +6601,6 @@
   <w:style w:type="table" w:styleId="80">
     <w:name w:val="Medium List 2 Accent 1"/>
     <w:basedOn w:val="12"/>
-    <w:qFormat/>
     <w:uiPriority w:val="66"/>
     <w:pPr>
       <w:spacing w:after="0" w:line="240" w:lineRule="auto"/>
@@ -6818,6 +6730,7 @@
   <w:style w:type="table" w:styleId="81">
     <w:name w:val="Medium List 2 Accent 2"/>
     <w:basedOn w:val="12"/>
+    <w:qFormat/>
     <w:uiPriority w:val="66"/>
     <w:pPr>
       <w:spacing w:after="0" w:line="240" w:lineRule="auto"/>
@@ -6947,6 +6860,7 @@
   <w:style w:type="table" w:styleId="82">
     <w:name w:val="Medium List 2 Accent 3"/>
     <w:basedOn w:val="12"/>
+    <w:qFormat/>
     <w:uiPriority w:val="66"/>
     <w:pPr>
       <w:spacing w:after="0" w:line="240" w:lineRule="auto"/>
@@ -7076,6 +6990,7 @@
   <w:style w:type="table" w:styleId="83">
     <w:name w:val="Medium List 2 Accent 4"/>
     <w:basedOn w:val="12"/>
+    <w:qFormat/>
     <w:uiPriority w:val="66"/>
     <w:pPr>
       <w:spacing w:after="0" w:line="240" w:lineRule="auto"/>
@@ -7335,7 +7250,6 @@
   <w:style w:type="table" w:styleId="85">
     <w:name w:val="Medium List 2 Accent 6"/>
     <w:basedOn w:val="12"/>
-    <w:qFormat/>
     <w:uiPriority w:val="66"/>
     <w:pPr>
       <w:spacing w:after="0" w:line="240" w:lineRule="auto"/>
@@ -7465,7 +7379,6 @@
   <w:style w:type="table" w:styleId="86">
     <w:name w:val="Medium Grid 1"/>
     <w:basedOn w:val="12"/>
-    <w:qFormat/>
     <w:uiPriority w:val="67"/>
     <w:pPr>
       <w:spacing w:after="0" w:line="240" w:lineRule="auto"/>
@@ -7535,6 +7448,7 @@
   <w:style w:type="table" w:styleId="87">
     <w:name w:val="Medium Grid 1 Accent 1"/>
     <w:basedOn w:val="12"/>
+    <w:qFormat/>
     <w:uiPriority w:val="67"/>
     <w:pPr>
       <w:spacing w:after="0" w:line="240" w:lineRule="auto"/>
@@ -7604,7 +7518,6 @@
   <w:style w:type="table" w:styleId="88">
     <w:name w:val="Medium Grid 1 Accent 2"/>
     <w:basedOn w:val="12"/>
-    <w:qFormat/>
     <w:uiPriority w:val="67"/>
     <w:pPr>
       <w:spacing w:after="0" w:line="240" w:lineRule="auto"/>
@@ -7744,6 +7657,7 @@
   <w:style w:type="table" w:styleId="90">
     <w:name w:val="Medium Grid 1 Accent 4"/>
     <w:basedOn w:val="12"/>
+    <w:qFormat/>
     <w:uiPriority w:val="67"/>
     <w:pPr>
       <w:spacing w:after="0" w:line="240" w:lineRule="auto"/>
@@ -7882,7 +7796,6 @@
   <w:style w:type="table" w:styleId="92">
     <w:name w:val="Medium Grid 1 Accent 6"/>
     <w:basedOn w:val="12"/>
-    <w:qFormat/>
     <w:uiPriority w:val="67"/>
     <w:pPr>
       <w:spacing w:after="0" w:line="240" w:lineRule="auto"/>
@@ -7952,7 +7865,6 @@
   <w:style w:type="table" w:styleId="93">
     <w:name w:val="Medium Grid 2"/>
     <w:basedOn w:val="12"/>
-    <w:qFormat/>
     <w:uiPriority w:val="68"/>
     <w:pPr>
       <w:spacing w:after="0" w:line="240" w:lineRule="auto"/>
@@ -8099,7 +8011,6 @@
   <w:style w:type="table" w:styleId="94">
     <w:name w:val="Medium Grid 2 Accent 1"/>
     <w:basedOn w:val="12"/>
-    <w:qFormat/>
     <w:uiPriority w:val="68"/>
     <w:pPr>
       <w:spacing w:after="0" w:line="240" w:lineRule="auto"/>
@@ -8538,7 +8449,6 @@
   <w:style w:type="table" w:styleId="97">
     <w:name w:val="Medium Grid 2 Accent 4"/>
     <w:basedOn w:val="12"/>
-    <w:qFormat/>
     <w:uiPriority w:val="68"/>
     <w:pPr>
       <w:spacing w:after="0" w:line="240" w:lineRule="auto"/>
@@ -8685,6 +8595,7 @@
   <w:style w:type="table" w:styleId="98">
     <w:name w:val="Medium Grid 2 Accent 5"/>
     <w:basedOn w:val="12"/>
+    <w:qFormat/>
     <w:uiPriority w:val="68"/>
     <w:pPr>
       <w:spacing w:after="0" w:line="240" w:lineRule="auto"/>
@@ -8831,7 +8742,6 @@
   <w:style w:type="table" w:styleId="99">
     <w:name w:val="Medium Grid 2 Accent 6"/>
     <w:basedOn w:val="12"/>
-    <w:qFormat/>
     <w:uiPriority w:val="68"/>
     <w:pPr>
       <w:spacing w:after="0" w:line="240" w:lineRule="auto"/>
@@ -8978,6 +8888,7 @@
   <w:style w:type="table" w:styleId="100">
     <w:name w:val="Medium Grid 3"/>
     <w:basedOn w:val="12"/>
+    <w:qFormat/>
     <w:uiPriority w:val="69"/>
     <w:pPr>
       <w:spacing w:after="0" w:line="240" w:lineRule="auto"/>
@@ -9135,7 +9046,6 @@
   <w:style w:type="table" w:styleId="101">
     <w:name w:val="Medium Grid 3 Accent 1"/>
     <w:basedOn w:val="12"/>
-    <w:qFormat/>
     <w:uiPriority w:val="69"/>
     <w:pPr>
       <w:spacing w:after="0" w:line="240" w:lineRule="auto"/>
@@ -9923,7 +9833,6 @@
   <w:style w:type="table" w:styleId="106">
     <w:name w:val="Medium Grid 3 Accent 6"/>
     <w:basedOn w:val="12"/>
-    <w:qFormat/>
     <w:uiPriority w:val="69"/>
     <w:pPr>
       <w:spacing w:after="0" w:line="240" w:lineRule="auto"/>
@@ -10081,7 +9990,6 @@
   <w:style w:type="table" w:styleId="107">
     <w:name w:val="Dark List"/>
     <w:basedOn w:val="12"/>
-    <w:qFormat/>
     <w:uiPriority w:val="70"/>
     <w:pPr>
       <w:spacing w:after="0" w:line="240" w:lineRule="auto"/>
@@ -10888,7 +10796,6 @@
   <w:style w:type="table" w:styleId="114">
     <w:name w:val="Colorful Shading"/>
     <w:basedOn w:val="12"/>
-    <w:qFormat/>
     <w:uiPriority w:val="71"/>
     <w:pPr>
       <w:spacing w:after="0" w:line="240" w:lineRule="auto"/>
@@ -11333,7 +11240,6 @@
   <w:style w:type="table" w:styleId="117">
     <w:name w:val="Colorful Shading Accent 3"/>
     <w:basedOn w:val="12"/>
-    <w:qFormat/>
     <w:uiPriority w:val="71"/>
     <w:pPr>
       <w:spacing w:after="0" w:line="240" w:lineRule="auto"/>
@@ -11462,6 +11368,7 @@
   <w:style w:type="table" w:styleId="118">
     <w:name w:val="Colorful Shading Accent 4"/>
     <w:basedOn w:val="12"/>
+    <w:qFormat/>
     <w:uiPriority w:val="71"/>
     <w:pPr>
       <w:spacing w:after="0" w:line="240" w:lineRule="auto"/>
@@ -11906,7 +11813,6 @@
   <w:style w:type="table" w:styleId="121">
     <w:name w:val="Colorful List"/>
     <w:basedOn w:val="12"/>
-    <w:qFormat/>
     <w:uiPriority w:val="72"/>
     <w:pPr>
       <w:spacing w:after="0" w:line="240" w:lineRule="auto"/>
@@ -12275,7 +12181,6 @@
   <w:style w:type="table" w:styleId="125">
     <w:name w:val="Colorful List Accent 4"/>
     <w:basedOn w:val="12"/>
-    <w:qFormat/>
     <w:uiPriority w:val="72"/>
     <w:pPr>
       <w:spacing w:after="0" w:line="240" w:lineRule="auto"/>
@@ -12368,7 +12273,6 @@
   <w:style w:type="table" w:styleId="126">
     <w:name w:val="Colorful List Accent 5"/>
     <w:basedOn w:val="12"/>
-    <w:qFormat/>
     <w:uiPriority w:val="72"/>
     <w:pPr>
       <w:spacing w:after="0" w:line="240" w:lineRule="auto"/>
@@ -12649,7 +12553,6 @@
   <w:style w:type="table" w:styleId="129">
     <w:name w:val="Colorful Grid Accent 1"/>
     <w:basedOn w:val="12"/>
-    <w:qFormat/>
     <w:uiPriority w:val="73"/>
     <w:pPr>
       <w:spacing w:after="0" w:line="240" w:lineRule="auto"/>
@@ -12746,7 +12649,6 @@
   <w:style w:type="table" w:styleId="130">
     <w:name w:val="Colorful Grid Accent 2"/>
     <w:basedOn w:val="12"/>
-    <w:qFormat/>
     <w:uiPriority w:val="73"/>
     <w:pPr>
       <w:spacing w:after="0" w:line="240" w:lineRule="auto"/>
@@ -12843,7 +12745,6 @@
   <w:style w:type="table" w:styleId="131">
     <w:name w:val="Colorful Grid Accent 3"/>
     <w:basedOn w:val="12"/>
-    <w:qFormat/>
     <w:uiPriority w:val="73"/>
     <w:pPr>
       <w:spacing w:after="0" w:line="240" w:lineRule="auto"/>
@@ -12940,7 +12841,6 @@
   <w:style w:type="table" w:styleId="132">
     <w:name w:val="Colorful Grid Accent 4"/>
     <w:basedOn w:val="12"/>
-    <w:qFormat/>
     <w:uiPriority w:val="73"/>
     <w:pPr>
       <w:spacing w:after="0" w:line="240" w:lineRule="auto"/>
@@ -13311,6 +13211,7 @@
     <w:name w:val="Title Char"/>
     <w:basedOn w:val="11"/>
     <w:link w:val="36"/>
+    <w:qFormat/>
     <w:uiPriority w:val="10"/>
     <w:rPr>
       <w:rFonts w:asciiTheme="majorHAnsi" w:hAnsiTheme="majorHAnsi" w:eastAsiaTheme="majorEastAsia" w:cstheme="majorBidi"/>
@@ -13361,14 +13262,12 @@
     <w:name w:val="Body Text 2 Char"/>
     <w:basedOn w:val="11"/>
     <w:link w:val="14"/>
-    <w:qFormat/>
     <w:uiPriority w:val="99"/>
   </w:style>
   <w:style w:type="character" w:customStyle="1" w:styleId="146">
     <w:name w:val="Body Text 3 Char"/>
     <w:basedOn w:val="11"/>
     <w:link w:val="15"/>
-    <w:qFormat/>
     <w:uiPriority w:val="99"/>
     <w:rPr>
       <w:sz w:val="16"/>
@@ -13379,7 +13278,6 @@
     <w:name w:val="Macro Text Char"/>
     <w:basedOn w:val="11"/>
     <w:link w:val="32"/>
-    <w:qFormat/>
     <w:uiPriority w:val="99"/>
     <w:rPr>
       <w:rFonts w:ascii="Courier" w:hAnsi="Courier"/>
@@ -13426,7 +13324,6 @@
     <w:basedOn w:val="11"/>
     <w:link w:val="5"/>
     <w:semiHidden/>
-    <w:qFormat/>
     <w:uiPriority w:val="9"/>
     <w:rPr>
       <w:rFonts w:asciiTheme="majorHAnsi" w:hAnsiTheme="majorHAnsi" w:eastAsiaTheme="majorEastAsia" w:cstheme="majorBidi"/>
@@ -13447,7 +13344,6 @@
     <w:basedOn w:val="11"/>
     <w:link w:val="6"/>
     <w:semiHidden/>
-    <w:qFormat/>
     <w:uiPriority w:val="9"/>
     <w:rPr>
       <w:rFonts w:asciiTheme="majorHAnsi" w:hAnsiTheme="majorHAnsi" w:eastAsiaTheme="majorEastAsia" w:cstheme="majorBidi"/>
@@ -13472,7 +13368,6 @@
     <w:basedOn w:val="11"/>
     <w:link w:val="8"/>
     <w:semiHidden/>
-    <w:qFormat/>
     <w:uiPriority w:val="9"/>
     <w:rPr>
       <w:rFonts w:asciiTheme="majorHAnsi" w:hAnsiTheme="majorHAnsi" w:eastAsiaTheme="majorEastAsia" w:cstheme="majorBidi"/>
@@ -13512,7 +13407,6 @@
     <w:basedOn w:val="11"/>
     <w:link w:val="10"/>
     <w:semiHidden/>
-    <w:qFormat/>
     <w:uiPriority w:val="9"/>
     <w:rPr>
       <w:rFonts w:asciiTheme="majorHAnsi" w:hAnsiTheme="majorHAnsi" w:eastAsiaTheme="majorEastAsia" w:cstheme="majorBidi"/>

</xml_diff>